<commit_message>
docs: add README with run guide, coverage, traceability and checklist
ref: TODO.9
</commit_message>
<xml_diff>
--- a/Progress Test 1/README.docx
+++ b/Progress Test 1/README.docx
@@ -2,10 +2,17 @@
 <file path=word/document.xml><?xml version="1.0" encoding="utf-8"?>
 <w:document xmlns:wpc="http://schemas.microsoft.com/office/word/2010/wordprocessingCanvas" xmlns:cx="http://schemas.microsoft.com/office/drawing/2014/chartex" xmlns:cx1="http://schemas.microsoft.com/office/drawing/2015/9/8/chartex" xmlns:cx2="http://schemas.microsoft.com/office/drawing/2015/10/21/chartex" xmlns:cx3="http://schemas.microsoft.com/office/drawing/2016/5/9/chartex" xmlns:cx4="http://schemas.microsoft.com/office/drawing/2016/5/10/chartex" xmlns:cx5="http://schemas.microsoft.com/office/drawing/2016/5/11/chartex" xmlns:cx6="http://schemas.microsoft.com/office/drawing/2016/5/12/chartex" xmlns:cx7="http://schemas.microsoft.com/office/drawing/2016/5/13/chartex" xmlns:cx8="http://schemas.microsoft.com/office/drawing/2016/5/14/chartex" xmlns:mc="http://schemas.openxmlformats.org/markup-compatibility/2006" xmlns:aink="http://schemas.microsoft.com/office/drawing/2016/ink" xmlns:am3d="http://schemas.microsoft.com/office/drawing/2017/model3d" xmlns:o="urn:schemas-microsoft-com:office:office" xmlns:oel="http://schemas.microsoft.com/office/2019/extlst" xmlns:r="http://schemas.openxmlformats.org/officeDocument/2006/relationships" xmlns:m="http://schemas.openxmlformats.org/officeDocument/2006/math" xmlns:v="urn:schemas-microsoft-com:vml" xmlns:wp14="http://schemas.microsoft.com/office/word/2010/wordprocessingDrawing" xmlns:wp="http://schemas.openxmlformats.org/drawingml/2006/wordprocessingDrawing" xmlns:w10="urn:schemas-microsoft-com:office:word" xmlns:w="http://schemas.openxmlformats.org/wordprocessingml/2006/main" xmlns:w14="http://schemas.microsoft.com/office/word/2010/wordml" xmlns:w15="http://schemas.microsoft.com/office/word/2012/wordml" xmlns:w16cex="http://schemas.microsoft.com/office/word/2018/wordml/cex" xmlns:w16cid="http://schemas.microsoft.com/office/word/2016/wordml/cid" xmlns:w16="http://schemas.microsoft.com/office/word/2018/wordml" xmlns:w16du="http://schemas.microsoft.com/office/word/2023/wordml/word16du" xmlns:w16sdtdh="http://schemas.microsoft.com/office/word/2020/wordml/sdtdatahash" xmlns:w16sdtfl="http://schemas.microsoft.com/office/word/2024/wordml/sdtformatlock" xmlns:w16se="http://schemas.microsoft.com/office/word/2015/wordml/symex" xmlns:wpg="http://schemas.microsoft.com/office/word/2010/wordprocessingGroup" xmlns:wpi="http://schemas.microsoft.com/office/word/2010/wordprocessingInk" xmlns:wne="http://schemas.microsoft.com/office/word/2006/wordml" xmlns:wps="http://schemas.microsoft.com/office/word/2010/wordprocessingShape" mc:Ignorable="w14 w15 w16se w16cid w16 w16cex w16sdtdh w16sdtfl w16du wp14">
   <w:body>
-    <w:p/>
+    <w:p>
+      <w:pPr>
+        <w:rPr>
+          <w:rFonts w:ascii="Times New Roman" w:hAnsi="Times New Roman" w:cs="Times New Roman"/>
+        </w:rPr>
+      </w:pPr>
+    </w:p>
+    <w:bookmarkStart w:id="0" w:name="_Toc241613027" w:displacedByCustomXml="next"/>
     <w:sdt>
       <w:sdtPr>
-        <w:id w:val="-400060187"/>
+        <w:id w:val="-1629462090"/>
         <w:docPartObj>
           <w:docPartGallery w:val="Table of Contents"/>
           <w:docPartUnique/>
@@ -30,14 +37,14 @@
           <w:pPr>
             <w:pStyle w:val="TOCHeading"/>
             <w:rPr>
-              <w:sz w:val="44"/>
-              <w:szCs w:val="44"/>
+              <w:sz w:val="40"/>
+              <w:szCs w:val="40"/>
             </w:rPr>
           </w:pPr>
           <w:r>
             <w:rPr>
-              <w:sz w:val="44"/>
-              <w:szCs w:val="44"/>
+              <w:sz w:val="40"/>
+              <w:szCs w:val="40"/>
             </w:rPr>
             <w:t>Contents</w:t>
           </w:r>
@@ -50,38 +57,39 @@
             </w:tabs>
             <w:rPr>
               <w:noProof/>
-              <w:sz w:val="44"/>
-              <w:szCs w:val="44"/>
+              <w:sz w:val="40"/>
+              <w:szCs w:val="40"/>
             </w:rPr>
           </w:pPr>
           <w:r>
             <w:rPr>
-              <w:sz w:val="44"/>
-              <w:szCs w:val="44"/>
+              <w:sz w:val="40"/>
+              <w:szCs w:val="40"/>
             </w:rPr>
             <w:fldChar w:fldCharType="begin"/>
           </w:r>
           <w:r>
             <w:rPr>
-              <w:sz w:val="44"/>
-              <w:szCs w:val="44"/>
+              <w:sz w:val="40"/>
+              <w:szCs w:val="40"/>
             </w:rPr>
             <w:instrText xml:space="preserve"> TOC \o "1-3" \h \z \u </w:instrText>
           </w:r>
           <w:r>
             <w:rPr>
-              <w:sz w:val="44"/>
-              <w:szCs w:val="44"/>
+              <w:sz w:val="40"/>
+              <w:szCs w:val="40"/>
             </w:rPr>
             <w:fldChar w:fldCharType="separate"/>
           </w:r>
-          <w:hyperlink w:anchor="_Toc241613026" w:history="1">
+          <w:hyperlink w:anchor="_Toc241613417" w:history="1">
             <w:r>
               <w:rPr>
                 <w:rStyle w:val="Hyperlink"/>
+                <w:rFonts w:ascii="Times New Roman" w:hAnsi="Times New Roman" w:cs="Times New Roman"/>
                 <w:noProof/>
-                <w:sz w:val="44"/>
-                <w:szCs w:val="44"/>
+                <w:sz w:val="40"/>
+                <w:szCs w:val="40"/>
               </w:rPr>
               <w:t>I.Check List</w:t>
             </w:r>
@@ -89,8 +97,8 @@
               <w:rPr>
                 <w:noProof/>
                 <w:webHidden/>
-                <w:sz w:val="44"/>
-                <w:szCs w:val="44"/>
+                <w:sz w:val="40"/>
+                <w:szCs w:val="40"/>
               </w:rPr>
               <w:tab/>
             </w:r>
@@ -98,8 +106,8 @@
               <w:rPr>
                 <w:noProof/>
                 <w:webHidden/>
-                <w:sz w:val="44"/>
-                <w:szCs w:val="44"/>
+                <w:sz w:val="40"/>
+                <w:szCs w:val="40"/>
               </w:rPr>
               <w:fldChar w:fldCharType="begin"/>
             </w:r>
@@ -107,25 +115,25 @@
               <w:rPr>
                 <w:noProof/>
                 <w:webHidden/>
-                <w:sz w:val="44"/>
-                <w:szCs w:val="44"/>
-              </w:rPr>
-              <w:instrText xml:space="preserve"> PAGEREF _Toc241613026 \h </w:instrText>
+                <w:sz w:val="40"/>
+                <w:szCs w:val="40"/>
+              </w:rPr>
+              <w:instrText xml:space="preserve"> PAGEREF _Toc241613417 \h </w:instrText>
             </w:r>
             <w:r>
               <w:rPr>
                 <w:noProof/>
                 <w:webHidden/>
-                <w:sz w:val="44"/>
-                <w:szCs w:val="44"/>
+                <w:sz w:val="40"/>
+                <w:szCs w:val="40"/>
               </w:rPr>
             </w:r>
             <w:r>
               <w:rPr>
                 <w:noProof/>
                 <w:webHidden/>
-                <w:sz w:val="44"/>
-                <w:szCs w:val="44"/>
+                <w:sz w:val="40"/>
+                <w:szCs w:val="40"/>
               </w:rPr>
               <w:fldChar w:fldCharType="separate"/>
             </w:r>
@@ -133,8 +141,8 @@
               <w:rPr>
                 <w:noProof/>
                 <w:webHidden/>
-                <w:sz w:val="44"/>
-                <w:szCs w:val="44"/>
+                <w:sz w:val="40"/>
+                <w:szCs w:val="40"/>
               </w:rPr>
               <w:t>1</w:t>
             </w:r>
@@ -142,8 +150,8 @@
               <w:rPr>
                 <w:noProof/>
                 <w:webHidden/>
-                <w:sz w:val="44"/>
-                <w:szCs w:val="44"/>
+                <w:sz w:val="40"/>
+                <w:szCs w:val="40"/>
               </w:rPr>
               <w:fldChar w:fldCharType="end"/>
             </w:r>
@@ -157,17 +165,18 @@
             </w:tabs>
             <w:rPr>
               <w:noProof/>
-              <w:sz w:val="44"/>
-              <w:szCs w:val="44"/>
+              <w:sz w:val="40"/>
+              <w:szCs w:val="40"/>
             </w:rPr>
           </w:pPr>
-          <w:hyperlink w:anchor="_Toc241613027" w:history="1">
+          <w:hyperlink w:anchor="_Toc241613418" w:history="1">
             <w:r>
               <w:rPr>
                 <w:rStyle w:val="Hyperlink"/>
+                <w:rFonts w:ascii="Times New Roman" w:hAnsi="Times New Roman" w:cs="Times New Roman"/>
                 <w:noProof/>
-                <w:sz w:val="44"/>
-                <w:szCs w:val="44"/>
+                <w:sz w:val="40"/>
+                <w:szCs w:val="40"/>
               </w:rPr>
               <w:t>II. jacoco coverage screenshot and mutation table</w:t>
             </w:r>
@@ -175,8 +184,8 @@
               <w:rPr>
                 <w:noProof/>
                 <w:webHidden/>
-                <w:sz w:val="44"/>
-                <w:szCs w:val="44"/>
+                <w:sz w:val="40"/>
+                <w:szCs w:val="40"/>
               </w:rPr>
               <w:tab/>
             </w:r>
@@ -184,8 +193,8 @@
               <w:rPr>
                 <w:noProof/>
                 <w:webHidden/>
-                <w:sz w:val="44"/>
-                <w:szCs w:val="44"/>
+                <w:sz w:val="40"/>
+                <w:szCs w:val="40"/>
               </w:rPr>
               <w:fldChar w:fldCharType="begin"/>
             </w:r>
@@ -193,25 +202,25 @@
               <w:rPr>
                 <w:noProof/>
                 <w:webHidden/>
-                <w:sz w:val="44"/>
-                <w:szCs w:val="44"/>
-              </w:rPr>
-              <w:instrText xml:space="preserve"> PAGEREF _Toc241613027 \h </w:instrText>
+                <w:sz w:val="40"/>
+                <w:szCs w:val="40"/>
+              </w:rPr>
+              <w:instrText xml:space="preserve"> PAGEREF _Toc241613418 \h </w:instrText>
             </w:r>
             <w:r>
               <w:rPr>
                 <w:noProof/>
                 <w:webHidden/>
-                <w:sz w:val="44"/>
-                <w:szCs w:val="44"/>
+                <w:sz w:val="40"/>
+                <w:szCs w:val="40"/>
               </w:rPr>
             </w:r>
             <w:r>
               <w:rPr>
                 <w:noProof/>
                 <w:webHidden/>
-                <w:sz w:val="44"/>
-                <w:szCs w:val="44"/>
+                <w:sz w:val="40"/>
+                <w:szCs w:val="40"/>
               </w:rPr>
               <w:fldChar w:fldCharType="separate"/>
             </w:r>
@@ -219,8 +228,8 @@
               <w:rPr>
                 <w:noProof/>
                 <w:webHidden/>
-                <w:sz w:val="44"/>
-                <w:szCs w:val="44"/>
+                <w:sz w:val="40"/>
+                <w:szCs w:val="40"/>
               </w:rPr>
               <w:t>1</w:t>
             </w:r>
@@ -228,8 +237,8 @@
               <w:rPr>
                 <w:noProof/>
                 <w:webHidden/>
-                <w:sz w:val="44"/>
-                <w:szCs w:val="44"/>
+                <w:sz w:val="40"/>
+                <w:szCs w:val="40"/>
               </w:rPr>
               <w:fldChar w:fldCharType="end"/>
             </w:r>
@@ -241,322 +250,521 @@
               <w:b/>
               <w:bCs/>
               <w:noProof/>
-              <w:sz w:val="44"/>
-              <w:szCs w:val="44"/>
+              <w:sz w:val="40"/>
+              <w:szCs w:val="40"/>
             </w:rPr>
             <w:fldChar w:fldCharType="end"/>
           </w:r>
         </w:p>
       </w:sdtContent>
     </w:sdt>
-    <w:p/>
+    <w:p>
+      <w:pPr>
+        <w:rPr>
+          <w:rFonts w:ascii="Times New Roman" w:hAnsi="Times New Roman" w:cs="Times New Roman"/>
+        </w:rPr>
+      </w:pPr>
+    </w:p>
+    <w:p>
+      <w:pPr>
+        <w:rPr>
+          <w:rFonts w:ascii="Times New Roman" w:hAnsi="Times New Roman" w:cs="Times New Roman"/>
+        </w:rPr>
+      </w:pPr>
+    </w:p>
     <w:p>
       <w:pPr>
         <w:pStyle w:val="Heading1"/>
+        <w:rPr>
+          <w:rFonts w:ascii="Times New Roman" w:hAnsi="Times New Roman" w:cs="Times New Roman"/>
+        </w:rPr>
       </w:pPr>
-      <w:bookmarkStart w:id="0" w:name="_Toc241613026"/>
-      <w:proofErr w:type="spellStart"/>
-      <w:r>
+      <w:bookmarkStart w:id="1" w:name="_Toc241613026"/>
+      <w:bookmarkStart w:id="2" w:name="_Toc241613417"/>
+      <w:proofErr w:type="spellStart"/>
+      <w:r>
+        <w:rPr>
+          <w:rFonts w:ascii="Times New Roman" w:hAnsi="Times New Roman" w:cs="Times New Roman"/>
+        </w:rPr>
         <w:t>I.Check</w:t>
       </w:r>
       <w:proofErr w:type="spellEnd"/>
       <w:r>
+        <w:rPr>
+          <w:rFonts w:ascii="Times New Roman" w:hAnsi="Times New Roman" w:cs="Times New Roman"/>
+        </w:rPr>
         <w:t xml:space="preserve"> List</w:t>
       </w:r>
-      <w:bookmarkEnd w:id="0"/>
+      <w:bookmarkEnd w:id="1"/>
+      <w:bookmarkEnd w:id="2"/>
     </w:p>
     <w:p>
       <w:pPr>
         <w:rPr>
-          <w:lang w:val="fr-FR"/>
+          <w:rFonts w:ascii="Times New Roman" w:hAnsi="Times New Roman" w:cs="Times New Roman"/>
         </w:rPr>
       </w:pPr>
       <w:r>
         <w:rPr>
+          <w:rFonts w:ascii="Times New Roman" w:hAnsi="Times New Roman" w:cs="Times New Roman"/>
           <w:b/>
           <w:bCs/>
-          <w:lang w:val="fr-FR"/>
-        </w:rPr>
-        <w:t>### A. M</w:t>
-      </w:r>
-      <w:proofErr w:type="spellStart"/>
-      <w:r>
-        <w:rPr>
+        </w:rPr>
+        <w:t xml:space="preserve">### A. </w:t>
+      </w:r>
+      <w:proofErr w:type="spellStart"/>
+      <w:r>
+        <w:rPr>
+          <w:rFonts w:ascii="Times New Roman" w:hAnsi="Times New Roman" w:cs="Times New Roman"/>
           <w:b/>
           <w:bCs/>
-          <w:lang w:val="fr-FR"/>
-        </w:rPr>
-        <w:t>ã</w:t>
-      </w:r>
-      <w:proofErr w:type="spellEnd"/>
-      <w:r>
-        <w:rPr>
+        </w:rPr>
+        <w:t>Mã</w:t>
+      </w:r>
+      <w:proofErr w:type="spellEnd"/>
+      <w:r>
+        <w:rPr>
+          <w:rFonts w:ascii="Times New Roman" w:hAnsi="Times New Roman" w:cs="Times New Roman"/>
           <w:b/>
           <w:bCs/>
-          <w:lang w:val="fr-FR"/>
         </w:rPr>
         <w:t xml:space="preserve"> production</w:t>
       </w:r>
     </w:p>
     <w:p>
-      <w:r>
+      <w:pPr>
+        <w:rPr>
+          <w:rFonts w:ascii="Times New Roman" w:hAnsi="Times New Roman" w:cs="Times New Roman"/>
+        </w:rPr>
+      </w:pPr>
+      <w:r>
+        <w:rPr>
+          <w:rFonts w:ascii="Times New Roman" w:hAnsi="Times New Roman" w:cs="Times New Roman"/>
+        </w:rPr>
         <w:t>- [</w:t>
       </w:r>
       <w:proofErr w:type="gramStart"/>
       <w:r>
-        <w:t>v</w:t>
-      </w:r>
-      <w:r>
-        <w:t xml:space="preserve"> ]</w:t>
+        <w:rPr>
+          <w:rFonts w:ascii="Times New Roman" w:hAnsi="Times New Roman" w:cs="Times New Roman"/>
+        </w:rPr>
+        <w:t>v ]</w:t>
       </w:r>
       <w:proofErr w:type="gramEnd"/>
       <w:r>
-        <w:t xml:space="preserve"> </w:t>
-      </w:r>
-      <w:r>
-        <w:rPr>
+        <w:rPr>
+          <w:rFonts w:ascii="Times New Roman" w:hAnsi="Times New Roman" w:cs="Times New Roman"/>
+        </w:rPr>
+        <w:t xml:space="preserve"> </w:t>
+      </w:r>
+      <w:r>
+        <w:rPr>
+          <w:rFonts w:ascii="Times New Roman" w:hAnsi="Times New Roman" w:cs="Times New Roman"/>
           <w:b/>
           <w:bCs/>
         </w:rPr>
         <w:t>**A1**</w:t>
       </w:r>
       <w:r>
+        <w:rPr>
+          <w:rFonts w:ascii="Times New Roman" w:hAnsi="Times New Roman" w:cs="Times New Roman"/>
+        </w:rPr>
         <w:t xml:space="preserve"> `</w:t>
       </w:r>
       <w:proofErr w:type="spellStart"/>
       <w:r>
+        <w:rPr>
+          <w:rFonts w:ascii="Times New Roman" w:hAnsi="Times New Roman" w:cs="Times New Roman"/>
+        </w:rPr>
         <w:t>mvn</w:t>
       </w:r>
       <w:proofErr w:type="spellEnd"/>
       <w:r>
+        <w:rPr>
+          <w:rFonts w:ascii="Times New Roman" w:hAnsi="Times New Roman" w:cs="Times New Roman"/>
+        </w:rPr>
         <w:t xml:space="preserve"> clean compile` </w:t>
       </w:r>
       <w:proofErr w:type="spellStart"/>
       <w:r>
+        <w:rPr>
+          <w:rFonts w:ascii="Times New Roman" w:hAnsi="Times New Roman" w:cs="Times New Roman"/>
+        </w:rPr>
         <w:t>thành</w:t>
       </w:r>
       <w:proofErr w:type="spellEnd"/>
       <w:r>
-        <w:t xml:space="preserve"> </w:t>
-      </w:r>
-      <w:proofErr w:type="spellStart"/>
-      <w:r>
+        <w:rPr>
+          <w:rFonts w:ascii="Times New Roman" w:hAnsi="Times New Roman" w:cs="Times New Roman"/>
+        </w:rPr>
+        <w:t xml:space="preserve"> </w:t>
+      </w:r>
+      <w:proofErr w:type="spellStart"/>
+      <w:r>
+        <w:rPr>
+          <w:rFonts w:ascii="Times New Roman" w:hAnsi="Times New Roman" w:cs="Times New Roman"/>
+        </w:rPr>
         <w:t>công</w:t>
       </w:r>
       <w:proofErr w:type="spellEnd"/>
     </w:p>
     <w:p>
-      <w:r>
+      <w:pPr>
+        <w:rPr>
+          <w:rFonts w:ascii="Times New Roman" w:hAnsi="Times New Roman" w:cs="Times New Roman"/>
+        </w:rPr>
+      </w:pPr>
+      <w:r>
+        <w:rPr>
+          <w:rFonts w:ascii="Times New Roman" w:hAnsi="Times New Roman" w:cs="Times New Roman"/>
+        </w:rPr>
         <w:t>- [</w:t>
       </w:r>
       <w:proofErr w:type="gramStart"/>
       <w:r>
-        <w:t>v</w:t>
-      </w:r>
-      <w:r>
-        <w:t xml:space="preserve"> ]</w:t>
+        <w:rPr>
+          <w:rFonts w:ascii="Times New Roman" w:hAnsi="Times New Roman" w:cs="Times New Roman"/>
+        </w:rPr>
+        <w:t>v ]</w:t>
       </w:r>
       <w:proofErr w:type="gramEnd"/>
       <w:r>
-        <w:t xml:space="preserve"> </w:t>
-      </w:r>
-      <w:r>
-        <w:rPr>
+        <w:rPr>
+          <w:rFonts w:ascii="Times New Roman" w:hAnsi="Times New Roman" w:cs="Times New Roman"/>
+        </w:rPr>
+        <w:t xml:space="preserve"> </w:t>
+      </w:r>
+      <w:r>
+        <w:rPr>
+          <w:rFonts w:ascii="Times New Roman" w:hAnsi="Times New Roman" w:cs="Times New Roman"/>
           <w:b/>
           <w:bCs/>
         </w:rPr>
         <w:t>**A2**</w:t>
       </w:r>
       <w:r>
+        <w:rPr>
+          <w:rFonts w:ascii="Times New Roman" w:hAnsi="Times New Roman" w:cs="Times New Roman"/>
+        </w:rPr>
         <w:t xml:space="preserve"> `</w:t>
       </w:r>
       <w:proofErr w:type="spellStart"/>
       <w:r>
+        <w:rPr>
+          <w:rFonts w:ascii="Times New Roman" w:hAnsi="Times New Roman" w:cs="Times New Roman"/>
+        </w:rPr>
         <w:t>AccountValidator</w:t>
       </w:r>
       <w:proofErr w:type="spellEnd"/>
       <w:r>
+        <w:rPr>
+          <w:rFonts w:ascii="Times New Roman" w:hAnsi="Times New Roman" w:cs="Times New Roman"/>
+        </w:rPr>
         <w:t xml:space="preserve">` </w:t>
       </w:r>
       <w:proofErr w:type="spellStart"/>
       <w:r>
+        <w:rPr>
+          <w:rFonts w:ascii="Times New Roman" w:hAnsi="Times New Roman" w:cs="Times New Roman"/>
+        </w:rPr>
         <w:t>đủ</w:t>
       </w:r>
       <w:proofErr w:type="spellEnd"/>
       <w:r>
+        <w:rPr>
+          <w:rFonts w:ascii="Times New Roman" w:hAnsi="Times New Roman" w:cs="Times New Roman"/>
+        </w:rPr>
         <w:t xml:space="preserve"> 5 </w:t>
       </w:r>
       <w:proofErr w:type="spellStart"/>
       <w:r>
+        <w:rPr>
+          <w:rFonts w:ascii="Times New Roman" w:hAnsi="Times New Roman" w:cs="Times New Roman"/>
+        </w:rPr>
         <w:t>hàm</w:t>
       </w:r>
       <w:proofErr w:type="spellEnd"/>
       <w:r>
+        <w:rPr>
+          <w:rFonts w:ascii="Times New Roman" w:hAnsi="Times New Roman" w:cs="Times New Roman"/>
+        </w:rPr>
         <w:t xml:space="preserve">, null </w:t>
       </w:r>
       <w:proofErr w:type="spellStart"/>
       <w:r>
+        <w:rPr>
+          <w:rFonts w:ascii="Times New Roman" w:hAnsi="Times New Roman" w:cs="Times New Roman"/>
+        </w:rPr>
         <w:t>trả</w:t>
       </w:r>
       <w:proofErr w:type="spellEnd"/>
       <w:r>
+        <w:rPr>
+          <w:rFonts w:ascii="Times New Roman" w:hAnsi="Times New Roman" w:cs="Times New Roman"/>
+        </w:rPr>
         <w:t xml:space="preserve"> `false`, </w:t>
       </w:r>
       <w:proofErr w:type="spellStart"/>
       <w:r>
+        <w:rPr>
+          <w:rFonts w:ascii="Times New Roman" w:hAnsi="Times New Roman" w:cs="Times New Roman"/>
+        </w:rPr>
         <w:t>không</w:t>
       </w:r>
       <w:proofErr w:type="spellEnd"/>
       <w:r>
-        <w:t xml:space="preserve"> </w:t>
-      </w:r>
-      <w:proofErr w:type="spellStart"/>
-      <w:r>
+        <w:rPr>
+          <w:rFonts w:ascii="Times New Roman" w:hAnsi="Times New Roman" w:cs="Times New Roman"/>
+        </w:rPr>
+        <w:t xml:space="preserve"> </w:t>
+      </w:r>
+      <w:proofErr w:type="spellStart"/>
+      <w:r>
+        <w:rPr>
+          <w:rFonts w:ascii="Times New Roman" w:hAnsi="Times New Roman" w:cs="Times New Roman"/>
+        </w:rPr>
         <w:t>ném</w:t>
       </w:r>
       <w:proofErr w:type="spellEnd"/>
       <w:r>
+        <w:rPr>
+          <w:rFonts w:ascii="Times New Roman" w:hAnsi="Times New Roman" w:cs="Times New Roman"/>
+        </w:rPr>
         <w:t xml:space="preserve"> exception</w:t>
       </w:r>
     </w:p>
     <w:p>
-      <w:r>
+      <w:pPr>
+        <w:rPr>
+          <w:rFonts w:ascii="Times New Roman" w:hAnsi="Times New Roman" w:cs="Times New Roman"/>
+        </w:rPr>
+      </w:pPr>
+      <w:r>
+        <w:rPr>
+          <w:rFonts w:ascii="Times New Roman" w:hAnsi="Times New Roman" w:cs="Times New Roman"/>
+        </w:rPr>
         <w:t>- [</w:t>
       </w:r>
       <w:proofErr w:type="gramStart"/>
       <w:r>
-        <w:t>v</w:t>
-      </w:r>
-      <w:r>
-        <w:t xml:space="preserve"> ]</w:t>
+        <w:rPr>
+          <w:rFonts w:ascii="Times New Roman" w:hAnsi="Times New Roman" w:cs="Times New Roman"/>
+        </w:rPr>
+        <w:t>v ]</w:t>
       </w:r>
       <w:proofErr w:type="gramEnd"/>
       <w:r>
-        <w:t xml:space="preserve"> </w:t>
-      </w:r>
-      <w:r>
-        <w:rPr>
+        <w:rPr>
+          <w:rFonts w:ascii="Times New Roman" w:hAnsi="Times New Roman" w:cs="Times New Roman"/>
+        </w:rPr>
+        <w:t xml:space="preserve"> </w:t>
+      </w:r>
+      <w:r>
+        <w:rPr>
+          <w:rFonts w:ascii="Times New Roman" w:hAnsi="Times New Roman" w:cs="Times New Roman"/>
           <w:b/>
           <w:bCs/>
         </w:rPr>
         <w:t>**A3**</w:t>
       </w:r>
       <w:r>
-        <w:t xml:space="preserve"> </w:t>
-      </w:r>
-      <w:proofErr w:type="spellStart"/>
-      <w:r>
+        <w:rPr>
+          <w:rFonts w:ascii="Times New Roman" w:hAnsi="Times New Roman" w:cs="Times New Roman"/>
+        </w:rPr>
+        <w:t xml:space="preserve"> </w:t>
+      </w:r>
+      <w:proofErr w:type="spellStart"/>
+      <w:r>
+        <w:rPr>
+          <w:rFonts w:ascii="Times New Roman" w:hAnsi="Times New Roman" w:cs="Times New Roman"/>
+        </w:rPr>
         <w:t>Mật</w:t>
       </w:r>
       <w:proofErr w:type="spellEnd"/>
       <w:r>
-        <w:t xml:space="preserve"> </w:t>
-      </w:r>
-      <w:proofErr w:type="spellStart"/>
-      <w:r>
+        <w:rPr>
+          <w:rFonts w:ascii="Times New Roman" w:hAnsi="Times New Roman" w:cs="Times New Roman"/>
+        </w:rPr>
+        <w:t xml:space="preserve"> </w:t>
+      </w:r>
+      <w:proofErr w:type="spellStart"/>
+      <w:r>
+        <w:rPr>
+          <w:rFonts w:ascii="Times New Roman" w:hAnsi="Times New Roman" w:cs="Times New Roman"/>
+        </w:rPr>
         <w:t>khẩu</w:t>
       </w:r>
       <w:proofErr w:type="spellEnd"/>
       <w:r>
-        <w:t xml:space="preserve"> </w:t>
-      </w:r>
-      <w:proofErr w:type="spellStart"/>
-      <w:r>
+        <w:rPr>
+          <w:rFonts w:ascii="Times New Roman" w:hAnsi="Times New Roman" w:cs="Times New Roman"/>
+        </w:rPr>
+        <w:t xml:space="preserve"> </w:t>
+      </w:r>
+      <w:proofErr w:type="spellStart"/>
+      <w:r>
+        <w:rPr>
+          <w:rFonts w:ascii="Times New Roman" w:hAnsi="Times New Roman" w:cs="Times New Roman"/>
+        </w:rPr>
         <w:t>băm</w:t>
       </w:r>
       <w:proofErr w:type="spellEnd"/>
       <w:r>
+        <w:rPr>
+          <w:rFonts w:ascii="Times New Roman" w:hAnsi="Times New Roman" w:cs="Times New Roman"/>
+        </w:rPr>
         <w:t xml:space="preserve"> SHA-256 + salt </w:t>
       </w:r>
       <w:proofErr w:type="spellStart"/>
       <w:r>
+        <w:rPr>
+          <w:rFonts w:ascii="Times New Roman" w:hAnsi="Times New Roman" w:cs="Times New Roman"/>
+        </w:rPr>
         <w:t>riêng</w:t>
       </w:r>
       <w:proofErr w:type="spellEnd"/>
       <w:r>
+        <w:rPr>
+          <w:rFonts w:ascii="Times New Roman" w:hAnsi="Times New Roman" w:cs="Times New Roman"/>
+        </w:rPr>
         <w:t xml:space="preserve">, </w:t>
       </w:r>
       <w:proofErr w:type="spellStart"/>
       <w:r>
+        <w:rPr>
+          <w:rFonts w:ascii="Times New Roman" w:hAnsi="Times New Roman" w:cs="Times New Roman"/>
+        </w:rPr>
         <w:t>không</w:t>
       </w:r>
       <w:proofErr w:type="spellEnd"/>
       <w:r>
-        <w:t xml:space="preserve"> </w:t>
-      </w:r>
-      <w:proofErr w:type="spellStart"/>
-      <w:r>
+        <w:rPr>
+          <w:rFonts w:ascii="Times New Roman" w:hAnsi="Times New Roman" w:cs="Times New Roman"/>
+        </w:rPr>
+        <w:t xml:space="preserve"> </w:t>
+      </w:r>
+      <w:proofErr w:type="spellStart"/>
+      <w:r>
+        <w:rPr>
+          <w:rFonts w:ascii="Times New Roman" w:hAnsi="Times New Roman" w:cs="Times New Roman"/>
+        </w:rPr>
         <w:t>lưu</w:t>
       </w:r>
       <w:proofErr w:type="spellEnd"/>
       <w:r>
-        <w:t xml:space="preserve"> </w:t>
-      </w:r>
-      <w:proofErr w:type="spellStart"/>
-      <w:r>
+        <w:rPr>
+          <w:rFonts w:ascii="Times New Roman" w:hAnsi="Times New Roman" w:cs="Times New Roman"/>
+        </w:rPr>
+        <w:t xml:space="preserve"> </w:t>
+      </w:r>
+      <w:proofErr w:type="spellStart"/>
+      <w:r>
+        <w:rPr>
+          <w:rFonts w:ascii="Times New Roman" w:hAnsi="Times New Roman" w:cs="Times New Roman"/>
+        </w:rPr>
         <w:t>bản</w:t>
       </w:r>
       <w:proofErr w:type="spellEnd"/>
       <w:r>
-        <w:t xml:space="preserve"> </w:t>
-      </w:r>
-      <w:proofErr w:type="spellStart"/>
-      <w:r>
+        <w:rPr>
+          <w:rFonts w:ascii="Times New Roman" w:hAnsi="Times New Roman" w:cs="Times New Roman"/>
+        </w:rPr>
+        <w:t xml:space="preserve"> </w:t>
+      </w:r>
+      <w:proofErr w:type="spellStart"/>
+      <w:r>
+        <w:rPr>
+          <w:rFonts w:ascii="Times New Roman" w:hAnsi="Times New Roman" w:cs="Times New Roman"/>
+        </w:rPr>
         <w:t>rõ</w:t>
       </w:r>
       <w:proofErr w:type="spellEnd"/>
     </w:p>
     <w:p>
-      <w:r>
+      <w:pPr>
+        <w:rPr>
+          <w:rFonts w:ascii="Times New Roman" w:hAnsi="Times New Roman" w:cs="Times New Roman"/>
+        </w:rPr>
+      </w:pPr>
+      <w:r>
+        <w:rPr>
+          <w:rFonts w:ascii="Times New Roman" w:hAnsi="Times New Roman" w:cs="Times New Roman"/>
+        </w:rPr>
         <w:t>- [</w:t>
       </w:r>
       <w:proofErr w:type="gramStart"/>
       <w:r>
-        <w:t>v</w:t>
-      </w:r>
-      <w:r>
-        <w:t xml:space="preserve"> ]</w:t>
+        <w:rPr>
+          <w:rFonts w:ascii="Times New Roman" w:hAnsi="Times New Roman" w:cs="Times New Roman"/>
+        </w:rPr>
+        <w:t>v ]</w:t>
       </w:r>
       <w:proofErr w:type="gramEnd"/>
       <w:r>
-        <w:t xml:space="preserve"> </w:t>
-      </w:r>
-      <w:r>
-        <w:rPr>
+        <w:rPr>
+          <w:rFonts w:ascii="Times New Roman" w:hAnsi="Times New Roman" w:cs="Times New Roman"/>
+        </w:rPr>
+        <w:t xml:space="preserve"> </w:t>
+      </w:r>
+      <w:r>
+        <w:rPr>
+          <w:rFonts w:ascii="Times New Roman" w:hAnsi="Times New Roman" w:cs="Times New Roman"/>
           <w:b/>
           <w:bCs/>
         </w:rPr>
         <w:t>**A4**</w:t>
       </w:r>
       <w:r>
+        <w:rPr>
+          <w:rFonts w:ascii="Times New Roman" w:hAnsi="Times New Roman" w:cs="Times New Roman"/>
+        </w:rPr>
         <w:t xml:space="preserve"> `</w:t>
       </w:r>
       <w:proofErr w:type="gramStart"/>
       <w:r>
+        <w:rPr>
+          <w:rFonts w:ascii="Times New Roman" w:hAnsi="Times New Roman" w:cs="Times New Roman"/>
+        </w:rPr>
         <w:t>register(</w:t>
       </w:r>
       <w:proofErr w:type="gramEnd"/>
       <w:r>
+        <w:rPr>
+          <w:rFonts w:ascii="Times New Roman" w:hAnsi="Times New Roman" w:cs="Times New Roman"/>
+        </w:rPr>
         <w:t xml:space="preserve">)` </w:t>
       </w:r>
       <w:proofErr w:type="spellStart"/>
       <w:r>
+        <w:rPr>
+          <w:rFonts w:ascii="Times New Roman" w:hAnsi="Times New Roman" w:cs="Times New Roman"/>
+        </w:rPr>
         <w:t>đủ</w:t>
       </w:r>
       <w:proofErr w:type="spellEnd"/>
       <w:r>
+        <w:rPr>
+          <w:rFonts w:ascii="Times New Roman" w:hAnsi="Times New Roman" w:cs="Times New Roman"/>
+        </w:rPr>
         <w:t xml:space="preserve"> BR-REG-</w:t>
       </w:r>
       <w:proofErr w:type="gramStart"/>
       <w:r>
+        <w:rPr>
+          <w:rFonts w:ascii="Times New Roman" w:hAnsi="Times New Roman" w:cs="Times New Roman"/>
+        </w:rPr>
         <w:t>01..</w:t>
       </w:r>
       <w:proofErr w:type="gramEnd"/>
       <w:r>
+        <w:rPr>
+          <w:rFonts w:ascii="Times New Roman" w:hAnsi="Times New Roman" w:cs="Times New Roman"/>
+        </w:rPr>
         <w:t xml:space="preserve">10, </w:t>
       </w:r>
       <w:r>
         <w:rPr>
+          <w:rFonts w:ascii="Times New Roman" w:hAnsi="Times New Roman" w:cs="Times New Roman"/>
           <w:b/>
           <w:bCs/>
         </w:rPr>
@@ -565,6 +773,7 @@
       <w:proofErr w:type="spellStart"/>
       <w:r>
         <w:rPr>
+          <w:rFonts w:ascii="Times New Roman" w:hAnsi="Times New Roman" w:cs="Times New Roman"/>
           <w:b/>
           <w:bCs/>
         </w:rPr>
@@ -573,6 +782,7 @@
       <w:proofErr w:type="spellEnd"/>
       <w:r>
         <w:rPr>
+          <w:rFonts w:ascii="Times New Roman" w:hAnsi="Times New Roman" w:cs="Times New Roman"/>
           <w:b/>
           <w:bCs/>
         </w:rPr>
@@ -581,6 +791,7 @@
       <w:proofErr w:type="spellStart"/>
       <w:r>
         <w:rPr>
+          <w:rFonts w:ascii="Times New Roman" w:hAnsi="Times New Roman" w:cs="Times New Roman"/>
           <w:b/>
           <w:bCs/>
         </w:rPr>
@@ -589,6 +800,7 @@
       <w:proofErr w:type="spellEnd"/>
       <w:r>
         <w:rPr>
+          <w:rFonts w:ascii="Times New Roman" w:hAnsi="Times New Roman" w:cs="Times New Roman"/>
           <w:b/>
           <w:bCs/>
         </w:rPr>
@@ -597,6 +809,7 @@
       <w:proofErr w:type="spellStart"/>
       <w:r>
         <w:rPr>
+          <w:rFonts w:ascii="Times New Roman" w:hAnsi="Times New Roman" w:cs="Times New Roman"/>
           <w:b/>
           <w:bCs/>
         </w:rPr>
@@ -605,6 +818,7 @@
       <w:proofErr w:type="spellEnd"/>
       <w:r>
         <w:rPr>
+          <w:rFonts w:ascii="Times New Roman" w:hAnsi="Times New Roman" w:cs="Times New Roman"/>
           <w:b/>
           <w:bCs/>
         </w:rPr>
@@ -612,459 +826,777 @@
       </w:r>
     </w:p>
     <w:p>
-      <w:r>
+      <w:pPr>
+        <w:rPr>
+          <w:rFonts w:ascii="Times New Roman" w:hAnsi="Times New Roman" w:cs="Times New Roman"/>
+        </w:rPr>
+      </w:pPr>
+      <w:r>
+        <w:rPr>
+          <w:rFonts w:ascii="Times New Roman" w:hAnsi="Times New Roman" w:cs="Times New Roman"/>
+        </w:rPr>
         <w:t>- [</w:t>
       </w:r>
       <w:proofErr w:type="gramStart"/>
       <w:r>
-        <w:t>v</w:t>
-      </w:r>
-      <w:r>
-        <w:t xml:space="preserve"> ]</w:t>
+        <w:rPr>
+          <w:rFonts w:ascii="Times New Roman" w:hAnsi="Times New Roman" w:cs="Times New Roman"/>
+        </w:rPr>
+        <w:t>v ]</w:t>
       </w:r>
       <w:proofErr w:type="gramEnd"/>
       <w:r>
-        <w:t xml:space="preserve"> </w:t>
-      </w:r>
-      <w:r>
-        <w:rPr>
+        <w:rPr>
+          <w:rFonts w:ascii="Times New Roman" w:hAnsi="Times New Roman" w:cs="Times New Roman"/>
+        </w:rPr>
+        <w:t xml:space="preserve"> </w:t>
+      </w:r>
+      <w:r>
+        <w:rPr>
+          <w:rFonts w:ascii="Times New Roman" w:hAnsi="Times New Roman" w:cs="Times New Roman"/>
           <w:b/>
           <w:bCs/>
         </w:rPr>
         <w:t>**A5**</w:t>
       </w:r>
       <w:r>
+        <w:rPr>
+          <w:rFonts w:ascii="Times New Roman" w:hAnsi="Times New Roman" w:cs="Times New Roman"/>
+        </w:rPr>
         <w:t xml:space="preserve"> `</w:t>
       </w:r>
       <w:proofErr w:type="gramStart"/>
       <w:r>
+        <w:rPr>
+          <w:rFonts w:ascii="Times New Roman" w:hAnsi="Times New Roman" w:cs="Times New Roman"/>
+        </w:rPr>
         <w:t>login(</w:t>
       </w:r>
       <w:proofErr w:type="gramEnd"/>
       <w:r>
+        <w:rPr>
+          <w:rFonts w:ascii="Times New Roman" w:hAnsi="Times New Roman" w:cs="Times New Roman"/>
+        </w:rPr>
         <w:t xml:space="preserve">)`: </w:t>
       </w:r>
       <w:proofErr w:type="spellStart"/>
       <w:r>
+        <w:rPr>
+          <w:rFonts w:ascii="Times New Roman" w:hAnsi="Times New Roman" w:cs="Times New Roman"/>
+        </w:rPr>
         <w:t>sai</w:t>
       </w:r>
       <w:proofErr w:type="spellEnd"/>
       <w:r>
+        <w:rPr>
+          <w:rFonts w:ascii="Times New Roman" w:hAnsi="Times New Roman" w:cs="Times New Roman"/>
+        </w:rPr>
         <w:t xml:space="preserve"> 5 </w:t>
       </w:r>
       <w:proofErr w:type="spellStart"/>
       <w:r>
+        <w:rPr>
+          <w:rFonts w:ascii="Times New Roman" w:hAnsi="Times New Roman" w:cs="Times New Roman"/>
+        </w:rPr>
         <w:t>lần</w:t>
       </w:r>
       <w:proofErr w:type="spellEnd"/>
       <w:r>
-        <w:t xml:space="preserve"> </w:t>
-      </w:r>
-      <w:proofErr w:type="spellStart"/>
-      <w:r>
+        <w:rPr>
+          <w:rFonts w:ascii="Times New Roman" w:hAnsi="Times New Roman" w:cs="Times New Roman"/>
+        </w:rPr>
+        <w:t xml:space="preserve"> </w:t>
+      </w:r>
+      <w:proofErr w:type="spellStart"/>
+      <w:r>
+        <w:rPr>
+          <w:rFonts w:ascii="Times New Roman" w:hAnsi="Times New Roman" w:cs="Times New Roman"/>
+        </w:rPr>
         <w:t>thì</w:t>
       </w:r>
       <w:proofErr w:type="spellEnd"/>
       <w:r>
-        <w:t xml:space="preserve"> </w:t>
-      </w:r>
-      <w:proofErr w:type="spellStart"/>
-      <w:r>
+        <w:rPr>
+          <w:rFonts w:ascii="Times New Roman" w:hAnsi="Times New Roman" w:cs="Times New Roman"/>
+        </w:rPr>
+        <w:t xml:space="preserve"> </w:t>
+      </w:r>
+      <w:proofErr w:type="spellStart"/>
+      <w:r>
+        <w:rPr>
+          <w:rFonts w:ascii="Times New Roman" w:hAnsi="Times New Roman" w:cs="Times New Roman"/>
+        </w:rPr>
         <w:t>khóa</w:t>
       </w:r>
       <w:proofErr w:type="spellEnd"/>
       <w:r>
+        <w:rPr>
+          <w:rFonts w:ascii="Times New Roman" w:hAnsi="Times New Roman" w:cs="Times New Roman"/>
+        </w:rPr>
         <w:t xml:space="preserve">; </w:t>
       </w:r>
       <w:proofErr w:type="spellStart"/>
       <w:r>
+        <w:rPr>
+          <w:rFonts w:ascii="Times New Roman" w:hAnsi="Times New Roman" w:cs="Times New Roman"/>
+        </w:rPr>
         <w:t>đang</w:t>
       </w:r>
       <w:proofErr w:type="spellEnd"/>
       <w:r>
-        <w:t xml:space="preserve"> </w:t>
-      </w:r>
-      <w:proofErr w:type="spellStart"/>
-      <w:r>
+        <w:rPr>
+          <w:rFonts w:ascii="Times New Roman" w:hAnsi="Times New Roman" w:cs="Times New Roman"/>
+        </w:rPr>
+        <w:t xml:space="preserve"> </w:t>
+      </w:r>
+      <w:proofErr w:type="spellStart"/>
+      <w:r>
+        <w:rPr>
+          <w:rFonts w:ascii="Times New Roman" w:hAnsi="Times New Roman" w:cs="Times New Roman"/>
+        </w:rPr>
         <w:t>khóa</w:t>
       </w:r>
       <w:proofErr w:type="spellEnd"/>
       <w:r>
-        <w:t xml:space="preserve"> </w:t>
-      </w:r>
-      <w:proofErr w:type="spellStart"/>
-      <w:r>
+        <w:rPr>
+          <w:rFonts w:ascii="Times New Roman" w:hAnsi="Times New Roman" w:cs="Times New Roman"/>
+        </w:rPr>
+        <w:t xml:space="preserve"> </w:t>
+      </w:r>
+      <w:proofErr w:type="spellStart"/>
+      <w:r>
+        <w:rPr>
+          <w:rFonts w:ascii="Times New Roman" w:hAnsi="Times New Roman" w:cs="Times New Roman"/>
+        </w:rPr>
         <w:t>không</w:t>
       </w:r>
       <w:proofErr w:type="spellEnd"/>
       <w:r>
-        <w:t xml:space="preserve"> </w:t>
-      </w:r>
-      <w:proofErr w:type="spellStart"/>
-      <w:r>
+        <w:rPr>
+          <w:rFonts w:ascii="Times New Roman" w:hAnsi="Times New Roman" w:cs="Times New Roman"/>
+        </w:rPr>
+        <w:t xml:space="preserve"> </w:t>
+      </w:r>
+      <w:proofErr w:type="spellStart"/>
+      <w:r>
+        <w:rPr>
+          <w:rFonts w:ascii="Times New Roman" w:hAnsi="Times New Roman" w:cs="Times New Roman"/>
+        </w:rPr>
         <w:t>tăng</w:t>
       </w:r>
       <w:proofErr w:type="spellEnd"/>
       <w:r>
-        <w:t xml:space="preserve"> </w:t>
-      </w:r>
-      <w:proofErr w:type="spellStart"/>
-      <w:r>
+        <w:rPr>
+          <w:rFonts w:ascii="Times New Roman" w:hAnsi="Times New Roman" w:cs="Times New Roman"/>
+        </w:rPr>
+        <w:t xml:space="preserve"> </w:t>
+      </w:r>
+      <w:proofErr w:type="spellStart"/>
+      <w:r>
+        <w:rPr>
+          <w:rFonts w:ascii="Times New Roman" w:hAnsi="Times New Roman" w:cs="Times New Roman"/>
+        </w:rPr>
         <w:t>bộ</w:t>
       </w:r>
       <w:proofErr w:type="spellEnd"/>
       <w:r>
-        <w:t xml:space="preserve"> </w:t>
-      </w:r>
-      <w:proofErr w:type="spellStart"/>
-      <w:r>
+        <w:rPr>
+          <w:rFonts w:ascii="Times New Roman" w:hAnsi="Times New Roman" w:cs="Times New Roman"/>
+        </w:rPr>
+        <w:t xml:space="preserve"> </w:t>
+      </w:r>
+      <w:proofErr w:type="spellStart"/>
+      <w:r>
+        <w:rPr>
+          <w:rFonts w:ascii="Times New Roman" w:hAnsi="Times New Roman" w:cs="Times New Roman"/>
+        </w:rPr>
         <w:t>đếm</w:t>
       </w:r>
       <w:proofErr w:type="spellEnd"/>
       <w:r>
+        <w:rPr>
+          <w:rFonts w:ascii="Times New Roman" w:hAnsi="Times New Roman" w:cs="Times New Roman"/>
+        </w:rPr>
         <w:t xml:space="preserve">; </w:t>
       </w:r>
       <w:proofErr w:type="spellStart"/>
       <w:r>
+        <w:rPr>
+          <w:rFonts w:ascii="Times New Roman" w:hAnsi="Times New Roman" w:cs="Times New Roman"/>
+        </w:rPr>
         <w:t>thành</w:t>
       </w:r>
       <w:proofErr w:type="spellEnd"/>
       <w:r>
-        <w:t xml:space="preserve"> </w:t>
-      </w:r>
-      <w:proofErr w:type="spellStart"/>
-      <w:r>
+        <w:rPr>
+          <w:rFonts w:ascii="Times New Roman" w:hAnsi="Times New Roman" w:cs="Times New Roman"/>
+        </w:rPr>
+        <w:t xml:space="preserve"> </w:t>
+      </w:r>
+      <w:proofErr w:type="spellStart"/>
+      <w:r>
+        <w:rPr>
+          <w:rFonts w:ascii="Times New Roman" w:hAnsi="Times New Roman" w:cs="Times New Roman"/>
+        </w:rPr>
         <w:t>công</w:t>
       </w:r>
       <w:proofErr w:type="spellEnd"/>
       <w:r>
-        <w:t xml:space="preserve"> </w:t>
-      </w:r>
-      <w:proofErr w:type="spellStart"/>
-      <w:r>
+        <w:rPr>
+          <w:rFonts w:ascii="Times New Roman" w:hAnsi="Times New Roman" w:cs="Times New Roman"/>
+        </w:rPr>
+        <w:t xml:space="preserve"> </w:t>
+      </w:r>
+      <w:proofErr w:type="spellStart"/>
+      <w:r>
+        <w:rPr>
+          <w:rFonts w:ascii="Times New Roman" w:hAnsi="Times New Roman" w:cs="Times New Roman"/>
+        </w:rPr>
         <w:t>thì</w:t>
       </w:r>
       <w:proofErr w:type="spellEnd"/>
       <w:r>
-        <w:t xml:space="preserve"> </w:t>
-      </w:r>
-      <w:proofErr w:type="spellStart"/>
-      <w:r>
+        <w:rPr>
+          <w:rFonts w:ascii="Times New Roman" w:hAnsi="Times New Roman" w:cs="Times New Roman"/>
+        </w:rPr>
+        <w:t xml:space="preserve"> </w:t>
+      </w:r>
+      <w:proofErr w:type="spellStart"/>
+      <w:r>
+        <w:rPr>
+          <w:rFonts w:ascii="Times New Roman" w:hAnsi="Times New Roman" w:cs="Times New Roman"/>
+        </w:rPr>
         <w:t>đặt</w:t>
       </w:r>
       <w:proofErr w:type="spellEnd"/>
       <w:r>
-        <w:t xml:space="preserve"> </w:t>
-      </w:r>
-      <w:proofErr w:type="spellStart"/>
-      <w:r>
+        <w:rPr>
+          <w:rFonts w:ascii="Times New Roman" w:hAnsi="Times New Roman" w:cs="Times New Roman"/>
+        </w:rPr>
+        <w:t xml:space="preserve"> </w:t>
+      </w:r>
+      <w:proofErr w:type="spellStart"/>
+      <w:r>
+        <w:rPr>
+          <w:rFonts w:ascii="Times New Roman" w:hAnsi="Times New Roman" w:cs="Times New Roman"/>
+        </w:rPr>
         <w:t>bộ</w:t>
       </w:r>
       <w:proofErr w:type="spellEnd"/>
       <w:r>
-        <w:t xml:space="preserve"> </w:t>
-      </w:r>
-      <w:proofErr w:type="spellStart"/>
-      <w:r>
+        <w:rPr>
+          <w:rFonts w:ascii="Times New Roman" w:hAnsi="Times New Roman" w:cs="Times New Roman"/>
+        </w:rPr>
+        <w:t xml:space="preserve"> </w:t>
+      </w:r>
+      <w:proofErr w:type="spellStart"/>
+      <w:r>
+        <w:rPr>
+          <w:rFonts w:ascii="Times New Roman" w:hAnsi="Times New Roman" w:cs="Times New Roman"/>
+        </w:rPr>
         <w:t>đếm</w:t>
       </w:r>
       <w:proofErr w:type="spellEnd"/>
       <w:r>
-        <w:t xml:space="preserve"> </w:t>
-      </w:r>
-      <w:proofErr w:type="spellStart"/>
-      <w:r>
+        <w:rPr>
+          <w:rFonts w:ascii="Times New Roman" w:hAnsi="Times New Roman" w:cs="Times New Roman"/>
+        </w:rPr>
+        <w:t xml:space="preserve"> </w:t>
+      </w:r>
+      <w:proofErr w:type="spellStart"/>
+      <w:r>
+        <w:rPr>
+          <w:rFonts w:ascii="Times New Roman" w:hAnsi="Times New Roman" w:cs="Times New Roman"/>
+        </w:rPr>
         <w:t>về</w:t>
       </w:r>
       <w:proofErr w:type="spellEnd"/>
       <w:r>
+        <w:rPr>
+          <w:rFonts w:ascii="Times New Roman" w:hAnsi="Times New Roman" w:cs="Times New Roman"/>
+        </w:rPr>
         <w:t xml:space="preserve"> 0</w:t>
       </w:r>
     </w:p>
     <w:p>
-      <w:r>
-        <w:t xml:space="preserve">- [ </w:t>
-      </w:r>
-      <w:r>
-        <w:t>v</w:t>
-      </w:r>
-      <w:r>
-        <w:t xml:space="preserve">] </w:t>
-      </w:r>
-      <w:r>
-        <w:rPr>
+      <w:pPr>
+        <w:rPr>
+          <w:rFonts w:ascii="Times New Roman" w:hAnsi="Times New Roman" w:cs="Times New Roman"/>
+        </w:rPr>
+      </w:pPr>
+      <w:r>
+        <w:rPr>
+          <w:rFonts w:ascii="Times New Roman" w:hAnsi="Times New Roman" w:cs="Times New Roman"/>
+        </w:rPr>
+        <w:t xml:space="preserve">- [ v] </w:t>
+      </w:r>
+      <w:r>
+        <w:rPr>
+          <w:rFonts w:ascii="Times New Roman" w:hAnsi="Times New Roman" w:cs="Times New Roman"/>
           <w:b/>
           <w:bCs/>
         </w:rPr>
         <w:t>**A6**</w:t>
       </w:r>
       <w:r>
+        <w:rPr>
+          <w:rFonts w:ascii="Times New Roman" w:hAnsi="Times New Roman" w:cs="Times New Roman"/>
+        </w:rPr>
         <w:t xml:space="preserve"> `</w:t>
       </w:r>
       <w:proofErr w:type="spellStart"/>
       <w:proofErr w:type="gramStart"/>
       <w:r>
+        <w:rPr>
+          <w:rFonts w:ascii="Times New Roman" w:hAnsi="Times New Roman" w:cs="Times New Roman"/>
+        </w:rPr>
         <w:t>unlockAccount</w:t>
       </w:r>
       <w:proofErr w:type="spellEnd"/>
       <w:r>
+        <w:rPr>
+          <w:rFonts w:ascii="Times New Roman" w:hAnsi="Times New Roman" w:cs="Times New Roman"/>
+        </w:rPr>
         <w:t>(</w:t>
       </w:r>
       <w:proofErr w:type="gramEnd"/>
       <w:r>
+        <w:rPr>
+          <w:rFonts w:ascii="Times New Roman" w:hAnsi="Times New Roman" w:cs="Times New Roman"/>
+        </w:rPr>
         <w:t xml:space="preserve">)` </w:t>
       </w:r>
       <w:proofErr w:type="spellStart"/>
       <w:r>
+        <w:rPr>
+          <w:rFonts w:ascii="Times New Roman" w:hAnsi="Times New Roman" w:cs="Times New Roman"/>
+        </w:rPr>
         <w:t>mở</w:t>
       </w:r>
       <w:proofErr w:type="spellEnd"/>
       <w:r>
-        <w:t xml:space="preserve"> </w:t>
-      </w:r>
-      <w:proofErr w:type="spellStart"/>
-      <w:r>
+        <w:rPr>
+          <w:rFonts w:ascii="Times New Roman" w:hAnsi="Times New Roman" w:cs="Times New Roman"/>
+        </w:rPr>
+        <w:t xml:space="preserve"> </w:t>
+      </w:r>
+      <w:proofErr w:type="spellStart"/>
+      <w:r>
+        <w:rPr>
+          <w:rFonts w:ascii="Times New Roman" w:hAnsi="Times New Roman" w:cs="Times New Roman"/>
+        </w:rPr>
         <w:t>khóa</w:t>
       </w:r>
       <w:proofErr w:type="spellEnd"/>
       <w:r>
-        <w:t xml:space="preserve"> </w:t>
-      </w:r>
-      <w:proofErr w:type="spellStart"/>
-      <w:r>
+        <w:rPr>
+          <w:rFonts w:ascii="Times New Roman" w:hAnsi="Times New Roman" w:cs="Times New Roman"/>
+        </w:rPr>
+        <w:t xml:space="preserve"> </w:t>
+      </w:r>
+      <w:proofErr w:type="spellStart"/>
+      <w:r>
+        <w:rPr>
+          <w:rFonts w:ascii="Times New Roman" w:hAnsi="Times New Roman" w:cs="Times New Roman"/>
+        </w:rPr>
         <w:t>và</w:t>
       </w:r>
       <w:proofErr w:type="spellEnd"/>
       <w:r>
-        <w:t xml:space="preserve"> </w:t>
-      </w:r>
-      <w:proofErr w:type="spellStart"/>
-      <w:r>
+        <w:rPr>
+          <w:rFonts w:ascii="Times New Roman" w:hAnsi="Times New Roman" w:cs="Times New Roman"/>
+        </w:rPr>
+        <w:t xml:space="preserve"> </w:t>
+      </w:r>
+      <w:proofErr w:type="spellStart"/>
+      <w:r>
+        <w:rPr>
+          <w:rFonts w:ascii="Times New Roman" w:hAnsi="Times New Roman" w:cs="Times New Roman"/>
+        </w:rPr>
         <w:t>đặt</w:t>
       </w:r>
       <w:proofErr w:type="spellEnd"/>
       <w:r>
+        <w:rPr>
+          <w:rFonts w:ascii="Times New Roman" w:hAnsi="Times New Roman" w:cs="Times New Roman"/>
+        </w:rPr>
         <w:t xml:space="preserve"> `</w:t>
       </w:r>
       <w:proofErr w:type="spellStart"/>
       <w:r>
+        <w:rPr>
+          <w:rFonts w:ascii="Times New Roman" w:hAnsi="Times New Roman" w:cs="Times New Roman"/>
+        </w:rPr>
         <w:t>failedAttempts</w:t>
       </w:r>
       <w:proofErr w:type="spellEnd"/>
       <w:r>
+        <w:rPr>
+          <w:rFonts w:ascii="Times New Roman" w:hAnsi="Times New Roman" w:cs="Times New Roman"/>
+        </w:rPr>
         <w:t xml:space="preserve"> = 0`</w:t>
       </w:r>
     </w:p>
     <w:p>
-      <w:r>
+      <w:pPr>
+        <w:rPr>
+          <w:rFonts w:ascii="Times New Roman" w:hAnsi="Times New Roman" w:cs="Times New Roman"/>
+        </w:rPr>
+      </w:pPr>
+      <w:r>
+        <w:rPr>
+          <w:rFonts w:ascii="Times New Roman" w:hAnsi="Times New Roman" w:cs="Times New Roman"/>
+        </w:rPr>
         <w:t>- [</w:t>
       </w:r>
       <w:proofErr w:type="gramStart"/>
       <w:r>
-        <w:t>v</w:t>
-      </w:r>
-      <w:r>
-        <w:t xml:space="preserve"> ]</w:t>
+        <w:rPr>
+          <w:rFonts w:ascii="Times New Roman" w:hAnsi="Times New Roman" w:cs="Times New Roman"/>
+        </w:rPr>
+        <w:t>v ]</w:t>
       </w:r>
       <w:proofErr w:type="gramEnd"/>
       <w:r>
-        <w:t xml:space="preserve"> </w:t>
-      </w:r>
-      <w:r>
-        <w:rPr>
+        <w:rPr>
+          <w:rFonts w:ascii="Times New Roman" w:hAnsi="Times New Roman" w:cs="Times New Roman"/>
+        </w:rPr>
+        <w:t xml:space="preserve"> </w:t>
+      </w:r>
+      <w:r>
+        <w:rPr>
+          <w:rFonts w:ascii="Times New Roman" w:hAnsi="Times New Roman" w:cs="Times New Roman"/>
           <w:b/>
           <w:bCs/>
         </w:rPr>
         <w:t>**A7**</w:t>
       </w:r>
       <w:r>
+        <w:rPr>
+          <w:rFonts w:ascii="Times New Roman" w:hAnsi="Times New Roman" w:cs="Times New Roman"/>
+        </w:rPr>
         <w:t xml:space="preserve"> Username/email </w:t>
       </w:r>
       <w:proofErr w:type="spellStart"/>
       <w:r>
+        <w:rPr>
+          <w:rFonts w:ascii="Times New Roman" w:hAnsi="Times New Roman" w:cs="Times New Roman"/>
+        </w:rPr>
         <w:t>không</w:t>
       </w:r>
       <w:proofErr w:type="spellEnd"/>
       <w:r>
-        <w:t xml:space="preserve"> </w:t>
-      </w:r>
-      <w:proofErr w:type="spellStart"/>
-      <w:r>
+        <w:rPr>
+          <w:rFonts w:ascii="Times New Roman" w:hAnsi="Times New Roman" w:cs="Times New Roman"/>
+        </w:rPr>
+        <w:t xml:space="preserve"> </w:t>
+      </w:r>
+      <w:proofErr w:type="spellStart"/>
+      <w:r>
+        <w:rPr>
+          <w:rFonts w:ascii="Times New Roman" w:hAnsi="Times New Roman" w:cs="Times New Roman"/>
+        </w:rPr>
         <w:t>phân</w:t>
       </w:r>
       <w:proofErr w:type="spellEnd"/>
       <w:r>
-        <w:t xml:space="preserve"> </w:t>
-      </w:r>
-      <w:proofErr w:type="spellStart"/>
-      <w:r>
+        <w:rPr>
+          <w:rFonts w:ascii="Times New Roman" w:hAnsi="Times New Roman" w:cs="Times New Roman"/>
+        </w:rPr>
+        <w:t xml:space="preserve"> </w:t>
+      </w:r>
+      <w:proofErr w:type="spellStart"/>
+      <w:r>
+        <w:rPr>
+          <w:rFonts w:ascii="Times New Roman" w:hAnsi="Times New Roman" w:cs="Times New Roman"/>
+        </w:rPr>
         <w:t>biệt</w:t>
       </w:r>
       <w:proofErr w:type="spellEnd"/>
       <w:r>
-        <w:t xml:space="preserve"> </w:t>
-      </w:r>
-      <w:proofErr w:type="spellStart"/>
-      <w:r>
+        <w:rPr>
+          <w:rFonts w:ascii="Times New Roman" w:hAnsi="Times New Roman" w:cs="Times New Roman"/>
+        </w:rPr>
+        <w:t xml:space="preserve"> </w:t>
+      </w:r>
+      <w:proofErr w:type="spellStart"/>
+      <w:r>
+        <w:rPr>
+          <w:rFonts w:ascii="Times New Roman" w:hAnsi="Times New Roman" w:cs="Times New Roman"/>
+        </w:rPr>
         <w:t>hoa</w:t>
       </w:r>
       <w:proofErr w:type="spellEnd"/>
       <w:r>
+        <w:rPr>
+          <w:rFonts w:ascii="Times New Roman" w:hAnsi="Times New Roman" w:cs="Times New Roman"/>
+        </w:rPr>
         <w:t>/</w:t>
       </w:r>
       <w:proofErr w:type="spellStart"/>
       <w:r>
+        <w:rPr>
+          <w:rFonts w:ascii="Times New Roman" w:hAnsi="Times New Roman" w:cs="Times New Roman"/>
+        </w:rPr>
         <w:t>thường</w:t>
       </w:r>
       <w:proofErr w:type="spellEnd"/>
       <w:r>
+        <w:rPr>
+          <w:rFonts w:ascii="Times New Roman" w:hAnsi="Times New Roman" w:cs="Times New Roman"/>
+        </w:rPr>
         <w:t xml:space="preserve"> (`</w:t>
       </w:r>
       <w:proofErr w:type="spellStart"/>
       <w:proofErr w:type="gramStart"/>
       <w:r>
+        <w:rPr>
+          <w:rFonts w:ascii="Times New Roman" w:hAnsi="Times New Roman" w:cs="Times New Roman"/>
+        </w:rPr>
         <w:t>toLowerCase</w:t>
       </w:r>
       <w:proofErr w:type="spellEnd"/>
       <w:r>
+        <w:rPr>
+          <w:rFonts w:ascii="Times New Roman" w:hAnsi="Times New Roman" w:cs="Times New Roman"/>
+        </w:rPr>
         <w:t>(</w:t>
       </w:r>
       <w:proofErr w:type="spellStart"/>
       <w:r>
+        <w:rPr>
+          <w:rFonts w:ascii="Times New Roman" w:hAnsi="Times New Roman" w:cs="Times New Roman"/>
+        </w:rPr>
         <w:t>Locale.ROOT</w:t>
       </w:r>
       <w:proofErr w:type="spellEnd"/>
       <w:r>
+        <w:rPr>
+          <w:rFonts w:ascii="Times New Roman" w:hAnsi="Times New Roman" w:cs="Times New Roman"/>
+        </w:rPr>
         <w:t>)`</w:t>
       </w:r>
       <w:proofErr w:type="gramEnd"/>
       <w:r>
+        <w:rPr>
+          <w:rFonts w:ascii="Times New Roman" w:hAnsi="Times New Roman" w:cs="Times New Roman"/>
+        </w:rPr>
         <w:t xml:space="preserve">), </w:t>
       </w:r>
       <w:proofErr w:type="spellStart"/>
       <w:r>
+        <w:rPr>
+          <w:rFonts w:ascii="Times New Roman" w:hAnsi="Times New Roman" w:cs="Times New Roman"/>
+        </w:rPr>
         <w:t>mật</w:t>
       </w:r>
       <w:proofErr w:type="spellEnd"/>
       <w:r>
-        <w:t xml:space="preserve"> </w:t>
-      </w:r>
-      <w:proofErr w:type="spellStart"/>
-      <w:r>
+        <w:rPr>
+          <w:rFonts w:ascii="Times New Roman" w:hAnsi="Times New Roman" w:cs="Times New Roman"/>
+        </w:rPr>
+        <w:t xml:space="preserve"> </w:t>
+      </w:r>
+      <w:proofErr w:type="spellStart"/>
+      <w:r>
+        <w:rPr>
+          <w:rFonts w:ascii="Times New Roman" w:hAnsi="Times New Roman" w:cs="Times New Roman"/>
+        </w:rPr>
         <w:t>khẩu</w:t>
       </w:r>
       <w:proofErr w:type="spellEnd"/>
       <w:r>
-        <w:t xml:space="preserve"> </w:t>
-      </w:r>
-      <w:proofErr w:type="spellStart"/>
-      <w:r>
+        <w:rPr>
+          <w:rFonts w:ascii="Times New Roman" w:hAnsi="Times New Roman" w:cs="Times New Roman"/>
+        </w:rPr>
+        <w:t xml:space="preserve"> </w:t>
+      </w:r>
+      <w:proofErr w:type="spellStart"/>
+      <w:r>
+        <w:rPr>
+          <w:rFonts w:ascii="Times New Roman" w:hAnsi="Times New Roman" w:cs="Times New Roman"/>
+        </w:rPr>
         <w:t>phân</w:t>
       </w:r>
       <w:proofErr w:type="spellEnd"/>
       <w:r>
-        <w:t xml:space="preserve"> </w:t>
-      </w:r>
-      <w:proofErr w:type="spellStart"/>
-      <w:r>
+        <w:rPr>
+          <w:rFonts w:ascii="Times New Roman" w:hAnsi="Times New Roman" w:cs="Times New Roman"/>
+        </w:rPr>
+        <w:t xml:space="preserve"> </w:t>
+      </w:r>
+      <w:proofErr w:type="spellStart"/>
+      <w:r>
+        <w:rPr>
+          <w:rFonts w:ascii="Times New Roman" w:hAnsi="Times New Roman" w:cs="Times New Roman"/>
+        </w:rPr>
         <w:t>biệt</w:t>
       </w:r>
       <w:proofErr w:type="spellEnd"/>
     </w:p>
     <w:p>
-      <w:r>
-        <w:t xml:space="preserve">- [ </w:t>
-      </w:r>
-      <w:r>
-        <w:t>v</w:t>
-      </w:r>
-      <w:r>
-        <w:t xml:space="preserve">] </w:t>
-      </w:r>
-      <w:r>
-        <w:rPr>
+      <w:pPr>
+        <w:rPr>
+          <w:rFonts w:ascii="Times New Roman" w:hAnsi="Times New Roman" w:cs="Times New Roman"/>
+        </w:rPr>
+      </w:pPr>
+      <w:r>
+        <w:rPr>
+          <w:rFonts w:ascii="Times New Roman" w:hAnsi="Times New Roman" w:cs="Times New Roman"/>
+        </w:rPr>
+        <w:t xml:space="preserve">- [ v] </w:t>
+      </w:r>
+      <w:r>
+        <w:rPr>
+          <w:rFonts w:ascii="Times New Roman" w:hAnsi="Times New Roman" w:cs="Times New Roman"/>
           <w:b/>
           <w:bCs/>
         </w:rPr>
         <w:t>**A8**</w:t>
       </w:r>
       <w:r>
-        <w:t xml:space="preserve"> </w:t>
-      </w:r>
-      <w:proofErr w:type="spellStart"/>
-      <w:r>
+        <w:rPr>
+          <w:rFonts w:ascii="Times New Roman" w:hAnsi="Times New Roman" w:cs="Times New Roman"/>
+        </w:rPr>
+        <w:t xml:space="preserve"> </w:t>
+      </w:r>
+      <w:proofErr w:type="spellStart"/>
+      <w:r>
+        <w:rPr>
+          <w:rFonts w:ascii="Times New Roman" w:hAnsi="Times New Roman" w:cs="Times New Roman"/>
+        </w:rPr>
         <w:t>Không</w:t>
       </w:r>
       <w:proofErr w:type="spellEnd"/>
       <w:r>
-        <w:t xml:space="preserve"> </w:t>
-      </w:r>
-      <w:proofErr w:type="spellStart"/>
-      <w:r>
+        <w:rPr>
+          <w:rFonts w:ascii="Times New Roman" w:hAnsi="Times New Roman" w:cs="Times New Roman"/>
+        </w:rPr>
+        <w:t xml:space="preserve"> </w:t>
+      </w:r>
+      <w:proofErr w:type="spellStart"/>
+      <w:r>
+        <w:rPr>
+          <w:rFonts w:ascii="Times New Roman" w:hAnsi="Times New Roman" w:cs="Times New Roman"/>
+        </w:rPr>
         <w:t>dùng</w:t>
       </w:r>
       <w:proofErr w:type="spellEnd"/>
       <w:r>
+        <w:rPr>
+          <w:rFonts w:ascii="Times New Roman" w:hAnsi="Times New Roman" w:cs="Times New Roman"/>
+        </w:rPr>
         <w:t xml:space="preserve"> `Clock`; </w:t>
       </w:r>
       <w:proofErr w:type="spellStart"/>
       <w:r>
+        <w:rPr>
+          <w:rFonts w:ascii="Times New Roman" w:hAnsi="Times New Roman" w:cs="Times New Roman"/>
+        </w:rPr>
         <w:t>không</w:t>
       </w:r>
       <w:proofErr w:type="spellEnd"/>
       <w:r>
+        <w:rPr>
+          <w:rFonts w:ascii="Times New Roman" w:hAnsi="Times New Roman" w:cs="Times New Roman"/>
+        </w:rPr>
         <w:t xml:space="preserve"> `</w:t>
       </w:r>
       <w:proofErr w:type="spellStart"/>
       <w:r>
+        <w:rPr>
+          <w:rFonts w:ascii="Times New Roman" w:hAnsi="Times New Roman" w:cs="Times New Roman"/>
+        </w:rPr>
         <w:t>System.out</w:t>
       </w:r>
       <w:proofErr w:type="spellEnd"/>
       <w:r>
+        <w:rPr>
+          <w:rFonts w:ascii="Times New Roman" w:hAnsi="Times New Roman" w:cs="Times New Roman"/>
+        </w:rPr>
         <w:t xml:space="preserve">`, </w:t>
       </w:r>
       <w:proofErr w:type="spellStart"/>
       <w:r>
+        <w:rPr>
+          <w:rFonts w:ascii="Times New Roman" w:hAnsi="Times New Roman" w:cs="Times New Roman"/>
+        </w:rPr>
         <w:t>không</w:t>
       </w:r>
       <w:proofErr w:type="spellEnd"/>
       <w:r>
-        <w:t xml:space="preserve"> </w:t>
-      </w:r>
-      <w:proofErr w:type="spellStart"/>
-      <w:r>
+        <w:rPr>
+          <w:rFonts w:ascii="Times New Roman" w:hAnsi="Times New Roman" w:cs="Times New Roman"/>
+        </w:rPr>
+        <w:t xml:space="preserve"> </w:t>
+      </w:r>
+      <w:proofErr w:type="spellStart"/>
+      <w:r>
+        <w:rPr>
+          <w:rFonts w:ascii="Times New Roman" w:hAnsi="Times New Roman" w:cs="Times New Roman"/>
+        </w:rPr>
         <w:t>biến</w:t>
       </w:r>
       <w:proofErr w:type="spellEnd"/>
       <w:r>
+        <w:rPr>
+          <w:rFonts w:ascii="Times New Roman" w:hAnsi="Times New Roman" w:cs="Times New Roman"/>
+        </w:rPr>
         <w:t xml:space="preserve"> static </w:t>
       </w:r>
       <w:proofErr w:type="spellStart"/>
       <w:r>
+        <w:rPr>
+          <w:rFonts w:ascii="Times New Roman" w:hAnsi="Times New Roman" w:cs="Times New Roman"/>
+        </w:rPr>
         <w:t>giữ</w:t>
       </w:r>
       <w:proofErr w:type="spellEnd"/>
       <w:r>
-        <w:t xml:space="preserve"> </w:t>
-      </w:r>
-      <w:proofErr w:type="spellStart"/>
-      <w:r>
+        <w:rPr>
+          <w:rFonts w:ascii="Times New Roman" w:hAnsi="Times New Roman" w:cs="Times New Roman"/>
+        </w:rPr>
+        <w:t xml:space="preserve"> </w:t>
+      </w:r>
+      <w:proofErr w:type="spellStart"/>
+      <w:r>
+        <w:rPr>
+          <w:rFonts w:ascii="Times New Roman" w:hAnsi="Times New Roman" w:cs="Times New Roman"/>
+        </w:rPr>
         <w:t>trạng</w:t>
       </w:r>
       <w:proofErr w:type="spellEnd"/>
       <w:r>
-        <w:t xml:space="preserve"> </w:t>
-      </w:r>
-      <w:proofErr w:type="spellStart"/>
-      <w:r>
+        <w:rPr>
+          <w:rFonts w:ascii="Times New Roman" w:hAnsi="Times New Roman" w:cs="Times New Roman"/>
+        </w:rPr>
+        <w:t xml:space="preserve"> </w:t>
+      </w:r>
+      <w:proofErr w:type="spellStart"/>
+      <w:r>
+        <w:rPr>
+          <w:rFonts w:ascii="Times New Roman" w:hAnsi="Times New Roman" w:cs="Times New Roman"/>
+        </w:rPr>
         <w:t>thái</w:t>
       </w:r>
       <w:proofErr w:type="spellEnd"/>
     </w:p>
-    <w:p/>
     <w:p>
-      <w:r>
-        <w:rPr>
+      <w:pPr>
+        <w:rPr>
+          <w:rFonts w:ascii="Times New Roman" w:hAnsi="Times New Roman" w:cs="Times New Roman"/>
+        </w:rPr>
+      </w:pPr>
+    </w:p>
+    <w:p>
+      <w:pPr>
+        <w:rPr>
+          <w:rFonts w:ascii="Times New Roman" w:hAnsi="Times New Roman" w:cs="Times New Roman"/>
+        </w:rPr>
+      </w:pPr>
+      <w:r>
+        <w:rPr>
+          <w:rFonts w:ascii="Times New Roman" w:hAnsi="Times New Roman" w:cs="Times New Roman"/>
           <w:b/>
           <w:bCs/>
         </w:rPr>
@@ -1073,6 +1605,7 @@
       <w:proofErr w:type="spellStart"/>
       <w:r>
         <w:rPr>
+          <w:rFonts w:ascii="Times New Roman" w:hAnsi="Times New Roman" w:cs="Times New Roman"/>
           <w:b/>
           <w:bCs/>
         </w:rPr>
@@ -1081,6 +1614,7 @@
       <w:proofErr w:type="spellEnd"/>
       <w:r>
         <w:rPr>
+          <w:rFonts w:ascii="Times New Roman" w:hAnsi="Times New Roman" w:cs="Times New Roman"/>
           <w:b/>
           <w:bCs/>
         </w:rPr>
@@ -1088,529 +1622,883 @@
       </w:r>
     </w:p>
     <w:p>
-      <w:r>
+      <w:pPr>
+        <w:rPr>
+          <w:rFonts w:ascii="Times New Roman" w:hAnsi="Times New Roman" w:cs="Times New Roman"/>
+        </w:rPr>
+      </w:pPr>
+      <w:r>
+        <w:rPr>
+          <w:rFonts w:ascii="Times New Roman" w:hAnsi="Times New Roman" w:cs="Times New Roman"/>
+        </w:rPr>
         <w:t>- [</w:t>
       </w:r>
       <w:proofErr w:type="gramStart"/>
       <w:r>
-        <w:t>v</w:t>
-      </w:r>
-      <w:r>
-        <w:t xml:space="preserve"> ]</w:t>
+        <w:rPr>
+          <w:rFonts w:ascii="Times New Roman" w:hAnsi="Times New Roman" w:cs="Times New Roman"/>
+        </w:rPr>
+        <w:t>v ]</w:t>
       </w:r>
       <w:proofErr w:type="gramEnd"/>
       <w:r>
-        <w:t xml:space="preserve"> </w:t>
-      </w:r>
-      <w:r>
-        <w:rPr>
+        <w:rPr>
+          <w:rFonts w:ascii="Times New Roman" w:hAnsi="Times New Roman" w:cs="Times New Roman"/>
+        </w:rPr>
+        <w:t xml:space="preserve"> </w:t>
+      </w:r>
+      <w:r>
+        <w:rPr>
+          <w:rFonts w:ascii="Times New Roman" w:hAnsi="Times New Roman" w:cs="Times New Roman"/>
           <w:b/>
           <w:bCs/>
         </w:rPr>
         <w:t>**B1**</w:t>
       </w:r>
       <w:r>
+        <w:rPr>
+          <w:rFonts w:ascii="Times New Roman" w:hAnsi="Times New Roman" w:cs="Times New Roman"/>
+        </w:rPr>
         <w:t xml:space="preserve"> ≥ 20 </w:t>
       </w:r>
       <w:proofErr w:type="spellStart"/>
       <w:r>
+        <w:rPr>
+          <w:rFonts w:ascii="Times New Roman" w:hAnsi="Times New Roman" w:cs="Times New Roman"/>
+        </w:rPr>
         <w:t>phương</w:t>
       </w:r>
       <w:proofErr w:type="spellEnd"/>
       <w:r>
-        <w:t xml:space="preserve"> </w:t>
-      </w:r>
-      <w:proofErr w:type="spellStart"/>
-      <w:r>
+        <w:rPr>
+          <w:rFonts w:ascii="Times New Roman" w:hAnsi="Times New Roman" w:cs="Times New Roman"/>
+        </w:rPr>
+        <w:t xml:space="preserve"> </w:t>
+      </w:r>
+      <w:proofErr w:type="spellStart"/>
+      <w:r>
+        <w:rPr>
+          <w:rFonts w:ascii="Times New Roman" w:hAnsi="Times New Roman" w:cs="Times New Roman"/>
+        </w:rPr>
         <w:t>thức</w:t>
       </w:r>
       <w:proofErr w:type="spellEnd"/>
       <w:r>
+        <w:rPr>
+          <w:rFonts w:ascii="Times New Roman" w:hAnsi="Times New Roman" w:cs="Times New Roman"/>
+        </w:rPr>
         <w:t xml:space="preserve"> test, ≥ 12 `@ParameterizedTest`, ≥ 60 </w:t>
       </w:r>
       <w:proofErr w:type="spellStart"/>
       <w:r>
+        <w:rPr>
+          <w:rFonts w:ascii="Times New Roman" w:hAnsi="Times New Roman" w:cs="Times New Roman"/>
+        </w:rPr>
         <w:t>lượt</w:t>
       </w:r>
       <w:proofErr w:type="spellEnd"/>
       <w:r>
-        <w:t xml:space="preserve"> </w:t>
-      </w:r>
-      <w:proofErr w:type="spellStart"/>
-      <w:r>
+        <w:rPr>
+          <w:rFonts w:ascii="Times New Roman" w:hAnsi="Times New Roman" w:cs="Times New Roman"/>
+        </w:rPr>
+        <w:t xml:space="preserve"> </w:t>
+      </w:r>
+      <w:proofErr w:type="spellStart"/>
+      <w:r>
+        <w:rPr>
+          <w:rFonts w:ascii="Times New Roman" w:hAnsi="Times New Roman" w:cs="Times New Roman"/>
+        </w:rPr>
         <w:t>chạy</w:t>
       </w:r>
       <w:proofErr w:type="spellEnd"/>
     </w:p>
     <w:p>
-      <w:r>
-        <w:t xml:space="preserve">- [ </w:t>
-      </w:r>
-      <w:r>
-        <w:t>v</w:t>
-      </w:r>
-      <w:r>
-        <w:t xml:space="preserve">] </w:t>
-      </w:r>
-      <w:r>
-        <w:rPr>
+      <w:pPr>
+        <w:rPr>
+          <w:rFonts w:ascii="Times New Roman" w:hAnsi="Times New Roman" w:cs="Times New Roman"/>
+        </w:rPr>
+      </w:pPr>
+      <w:r>
+        <w:rPr>
+          <w:rFonts w:ascii="Times New Roman" w:hAnsi="Times New Roman" w:cs="Times New Roman"/>
+        </w:rPr>
+        <w:t xml:space="preserve">- [ v] </w:t>
+      </w:r>
+      <w:r>
+        <w:rPr>
+          <w:rFonts w:ascii="Times New Roman" w:hAnsi="Times New Roman" w:cs="Times New Roman"/>
           <w:b/>
           <w:bCs/>
         </w:rPr>
         <w:t>**B2**</w:t>
       </w:r>
       <w:r>
-        <w:t xml:space="preserve"> </w:t>
-      </w:r>
-      <w:proofErr w:type="spellStart"/>
-      <w:r>
+        <w:rPr>
+          <w:rFonts w:ascii="Times New Roman" w:hAnsi="Times New Roman" w:cs="Times New Roman"/>
+        </w:rPr>
+        <w:t xml:space="preserve"> </w:t>
+      </w:r>
+      <w:proofErr w:type="spellStart"/>
+      <w:r>
+        <w:rPr>
+          <w:rFonts w:ascii="Times New Roman" w:hAnsi="Times New Roman" w:cs="Times New Roman"/>
+        </w:rPr>
         <w:t>Dùng</w:t>
       </w:r>
       <w:proofErr w:type="spellEnd"/>
       <w:r>
-        <w:t xml:space="preserve"> </w:t>
-      </w:r>
-      <w:proofErr w:type="spellStart"/>
-      <w:r>
+        <w:rPr>
+          <w:rFonts w:ascii="Times New Roman" w:hAnsi="Times New Roman" w:cs="Times New Roman"/>
+        </w:rPr>
+        <w:t xml:space="preserve"> </w:t>
+      </w:r>
+      <w:proofErr w:type="spellStart"/>
+      <w:r>
+        <w:rPr>
+          <w:rFonts w:ascii="Times New Roman" w:hAnsi="Times New Roman" w:cs="Times New Roman"/>
+        </w:rPr>
         <w:t>đủ</w:t>
       </w:r>
       <w:proofErr w:type="spellEnd"/>
       <w:r>
+        <w:rPr>
+          <w:rFonts w:ascii="Times New Roman" w:hAnsi="Times New Roman" w:cs="Times New Roman"/>
+        </w:rPr>
         <w:t xml:space="preserve"> `@ValueSource`, `@NullAndEmptySource`, `@CsvSource`, `@MethodSource`</w:t>
       </w:r>
     </w:p>
     <w:p>
-      <w:r>
+      <w:pPr>
+        <w:rPr>
+          <w:rFonts w:ascii="Times New Roman" w:hAnsi="Times New Roman" w:cs="Times New Roman"/>
+        </w:rPr>
+      </w:pPr>
+      <w:r>
+        <w:rPr>
+          <w:rFonts w:ascii="Times New Roman" w:hAnsi="Times New Roman" w:cs="Times New Roman"/>
+        </w:rPr>
         <w:t>- [</w:t>
       </w:r>
       <w:proofErr w:type="gramStart"/>
       <w:r>
-        <w:t>v</w:t>
-      </w:r>
-      <w:r>
-        <w:t xml:space="preserve"> ]</w:t>
+        <w:rPr>
+          <w:rFonts w:ascii="Times New Roman" w:hAnsi="Times New Roman" w:cs="Times New Roman"/>
+        </w:rPr>
+        <w:t>v ]</w:t>
       </w:r>
       <w:proofErr w:type="gramEnd"/>
       <w:r>
-        <w:t xml:space="preserve"> </w:t>
-      </w:r>
-      <w:r>
-        <w:rPr>
+        <w:rPr>
+          <w:rFonts w:ascii="Times New Roman" w:hAnsi="Times New Roman" w:cs="Times New Roman"/>
+        </w:rPr>
+        <w:t xml:space="preserve"> </w:t>
+      </w:r>
+      <w:r>
+        <w:rPr>
+          <w:rFonts w:ascii="Times New Roman" w:hAnsi="Times New Roman" w:cs="Times New Roman"/>
           <w:b/>
           <w:bCs/>
         </w:rPr>
         <w:t>**B3**</w:t>
       </w:r>
       <w:r>
-        <w:t xml:space="preserve"> </w:t>
-      </w:r>
-      <w:proofErr w:type="spellStart"/>
-      <w:r>
+        <w:rPr>
+          <w:rFonts w:ascii="Times New Roman" w:hAnsi="Times New Roman" w:cs="Times New Roman"/>
+        </w:rPr>
+        <w:t xml:space="preserve"> </w:t>
+      </w:r>
+      <w:proofErr w:type="spellStart"/>
+      <w:r>
+        <w:rPr>
+          <w:rFonts w:ascii="Times New Roman" w:hAnsi="Times New Roman" w:cs="Times New Roman"/>
+        </w:rPr>
         <w:t>Biên</w:t>
       </w:r>
       <w:proofErr w:type="spellEnd"/>
       <w:r>
+        <w:rPr>
+          <w:rFonts w:ascii="Times New Roman" w:hAnsi="Times New Roman" w:cs="Times New Roman"/>
+        </w:rPr>
         <w:t xml:space="preserve">: username 4/5/20/21, </w:t>
       </w:r>
       <w:proofErr w:type="spellStart"/>
       <w:r>
+        <w:rPr>
+          <w:rFonts w:ascii="Times New Roman" w:hAnsi="Times New Roman" w:cs="Times New Roman"/>
+        </w:rPr>
         <w:t>mật</w:t>
       </w:r>
       <w:proofErr w:type="spellEnd"/>
       <w:r>
-        <w:t xml:space="preserve"> </w:t>
-      </w:r>
-      <w:proofErr w:type="spellStart"/>
-      <w:r>
+        <w:rPr>
+          <w:rFonts w:ascii="Times New Roman" w:hAnsi="Times New Roman" w:cs="Times New Roman"/>
+        </w:rPr>
+        <w:t xml:space="preserve"> </w:t>
+      </w:r>
+      <w:proofErr w:type="spellStart"/>
+      <w:r>
+        <w:rPr>
+          <w:rFonts w:ascii="Times New Roman" w:hAnsi="Times New Roman" w:cs="Times New Roman"/>
+        </w:rPr>
         <w:t>khẩu</w:t>
       </w:r>
       <w:proofErr w:type="spellEnd"/>
       <w:r>
+        <w:rPr>
+          <w:rFonts w:ascii="Times New Roman" w:hAnsi="Times New Roman" w:cs="Times New Roman"/>
+        </w:rPr>
         <w:t xml:space="preserve"> 7/8/32/33, email 100/101, </w:t>
       </w:r>
       <w:proofErr w:type="spellStart"/>
       <w:r>
+        <w:rPr>
+          <w:rFonts w:ascii="Times New Roman" w:hAnsi="Times New Roman" w:cs="Times New Roman"/>
+        </w:rPr>
         <w:t>tuổi</w:t>
       </w:r>
       <w:proofErr w:type="spellEnd"/>
       <w:r>
+        <w:rPr>
+          <w:rFonts w:ascii="Times New Roman" w:hAnsi="Times New Roman" w:cs="Times New Roman"/>
+        </w:rPr>
         <w:t xml:space="preserve"> 17/18 (qua `</w:t>
       </w:r>
       <w:proofErr w:type="spellStart"/>
       <w:r>
+        <w:rPr>
+          <w:rFonts w:ascii="Times New Roman" w:hAnsi="Times New Roman" w:cs="Times New Roman"/>
+        </w:rPr>
         <w:t>calculateAge</w:t>
       </w:r>
       <w:proofErr w:type="spellEnd"/>
       <w:r>
+        <w:rPr>
+          <w:rFonts w:ascii="Times New Roman" w:hAnsi="Times New Roman" w:cs="Times New Roman"/>
+        </w:rPr>
         <w:t>`)</w:t>
       </w:r>
     </w:p>
     <w:p>
-      <w:r>
+      <w:pPr>
+        <w:rPr>
+          <w:rFonts w:ascii="Times New Roman" w:hAnsi="Times New Roman" w:cs="Times New Roman"/>
+        </w:rPr>
+      </w:pPr>
+      <w:r>
+        <w:rPr>
+          <w:rFonts w:ascii="Times New Roman" w:hAnsi="Times New Roman" w:cs="Times New Roman"/>
+        </w:rPr>
         <w:t>- [</w:t>
       </w:r>
       <w:proofErr w:type="gramStart"/>
       <w:r>
-        <w:t>v</w:t>
-      </w:r>
-      <w:r>
-        <w:t xml:space="preserve"> ]</w:t>
+        <w:rPr>
+          <w:rFonts w:ascii="Times New Roman" w:hAnsi="Times New Roman" w:cs="Times New Roman"/>
+        </w:rPr>
+        <w:t>v ]</w:t>
       </w:r>
       <w:proofErr w:type="gramEnd"/>
       <w:r>
-        <w:t xml:space="preserve"> </w:t>
-      </w:r>
-      <w:r>
-        <w:rPr>
+        <w:rPr>
+          <w:rFonts w:ascii="Times New Roman" w:hAnsi="Times New Roman" w:cs="Times New Roman"/>
+        </w:rPr>
+        <w:t xml:space="preserve"> </w:t>
+      </w:r>
+      <w:r>
+        <w:rPr>
+          <w:rFonts w:ascii="Times New Roman" w:hAnsi="Times New Roman" w:cs="Times New Roman"/>
           <w:b/>
           <w:bCs/>
         </w:rPr>
         <w:t>**B4**</w:t>
       </w:r>
       <w:r>
-        <w:t xml:space="preserve"> </w:t>
-      </w:r>
-      <w:proofErr w:type="spellStart"/>
-      <w:r>
+        <w:rPr>
+          <w:rFonts w:ascii="Times New Roman" w:hAnsi="Times New Roman" w:cs="Times New Roman"/>
+        </w:rPr>
+        <w:t xml:space="preserve"> </w:t>
+      </w:r>
+      <w:proofErr w:type="spellStart"/>
+      <w:r>
+        <w:rPr>
+          <w:rFonts w:ascii="Times New Roman" w:hAnsi="Times New Roman" w:cs="Times New Roman"/>
+        </w:rPr>
         <w:t>Biên</w:t>
       </w:r>
       <w:proofErr w:type="spellEnd"/>
       <w:r>
-        <w:t xml:space="preserve"> </w:t>
-      </w:r>
-      <w:proofErr w:type="spellStart"/>
-      <w:r>
+        <w:rPr>
+          <w:rFonts w:ascii="Times New Roman" w:hAnsi="Times New Roman" w:cs="Times New Roman"/>
+        </w:rPr>
+        <w:t xml:space="preserve"> </w:t>
+      </w:r>
+      <w:proofErr w:type="spellStart"/>
+      <w:r>
+        <w:rPr>
+          <w:rFonts w:ascii="Times New Roman" w:hAnsi="Times New Roman" w:cs="Times New Roman"/>
+        </w:rPr>
         <w:t>số</w:t>
       </w:r>
       <w:proofErr w:type="spellEnd"/>
       <w:r>
-        <w:t xml:space="preserve"> </w:t>
-      </w:r>
-      <w:proofErr w:type="spellStart"/>
-      <w:r>
+        <w:rPr>
+          <w:rFonts w:ascii="Times New Roman" w:hAnsi="Times New Roman" w:cs="Times New Roman"/>
+        </w:rPr>
+        <w:t xml:space="preserve"> </w:t>
+      </w:r>
+      <w:proofErr w:type="spellStart"/>
+      <w:r>
+        <w:rPr>
+          <w:rFonts w:ascii="Times New Roman" w:hAnsi="Times New Roman" w:cs="Times New Roman"/>
+        </w:rPr>
         <w:t>lần</w:t>
       </w:r>
       <w:proofErr w:type="spellEnd"/>
       <w:r>
-        <w:t xml:space="preserve"> </w:t>
-      </w:r>
-      <w:proofErr w:type="spellStart"/>
-      <w:r>
+        <w:rPr>
+          <w:rFonts w:ascii="Times New Roman" w:hAnsi="Times New Roman" w:cs="Times New Roman"/>
+        </w:rPr>
+        <w:t xml:space="preserve"> </w:t>
+      </w:r>
+      <w:proofErr w:type="spellStart"/>
+      <w:r>
+        <w:rPr>
+          <w:rFonts w:ascii="Times New Roman" w:hAnsi="Times New Roman" w:cs="Times New Roman"/>
+        </w:rPr>
         <w:t>đăng</w:t>
       </w:r>
       <w:proofErr w:type="spellEnd"/>
       <w:r>
-        <w:t xml:space="preserve"> </w:t>
-      </w:r>
-      <w:proofErr w:type="spellStart"/>
-      <w:r>
+        <w:rPr>
+          <w:rFonts w:ascii="Times New Roman" w:hAnsi="Times New Roman" w:cs="Times New Roman"/>
+        </w:rPr>
+        <w:t xml:space="preserve"> </w:t>
+      </w:r>
+      <w:proofErr w:type="spellStart"/>
+      <w:r>
+        <w:rPr>
+          <w:rFonts w:ascii="Times New Roman" w:hAnsi="Times New Roman" w:cs="Times New Roman"/>
+        </w:rPr>
         <w:t>nhập</w:t>
       </w:r>
       <w:proofErr w:type="spellEnd"/>
       <w:r>
-        <w:t xml:space="preserve"> </w:t>
-      </w:r>
-      <w:proofErr w:type="spellStart"/>
-      <w:r>
+        <w:rPr>
+          <w:rFonts w:ascii="Times New Roman" w:hAnsi="Times New Roman" w:cs="Times New Roman"/>
+        </w:rPr>
+        <w:t xml:space="preserve"> </w:t>
+      </w:r>
+      <w:proofErr w:type="spellStart"/>
+      <w:r>
+        <w:rPr>
+          <w:rFonts w:ascii="Times New Roman" w:hAnsi="Times New Roman" w:cs="Times New Roman"/>
+        </w:rPr>
         <w:t>sai</w:t>
       </w:r>
       <w:proofErr w:type="spellEnd"/>
       <w:r>
+        <w:rPr>
+          <w:rFonts w:ascii="Times New Roman" w:hAnsi="Times New Roman" w:cs="Times New Roman"/>
+        </w:rPr>
         <w:t xml:space="preserve"> 4/5 </w:t>
       </w:r>
       <w:proofErr w:type="spellStart"/>
       <w:r>
+        <w:rPr>
+          <w:rFonts w:ascii="Times New Roman" w:hAnsi="Times New Roman" w:cs="Times New Roman"/>
+        </w:rPr>
         <w:t>và</w:t>
       </w:r>
       <w:proofErr w:type="spellEnd"/>
       <w:r>
+        <w:rPr>
+          <w:rFonts w:ascii="Times New Roman" w:hAnsi="Times New Roman" w:cs="Times New Roman"/>
+        </w:rPr>
         <w:t xml:space="preserve"> test </w:t>
       </w:r>
       <w:proofErr w:type="spellStart"/>
       <w:r>
+        <w:rPr>
+          <w:rFonts w:ascii="Times New Roman" w:hAnsi="Times New Roman" w:cs="Times New Roman"/>
+        </w:rPr>
         <w:t>mở</w:t>
       </w:r>
       <w:proofErr w:type="spellEnd"/>
       <w:r>
-        <w:t xml:space="preserve"> </w:t>
-      </w:r>
-      <w:proofErr w:type="spellStart"/>
-      <w:r>
+        <w:rPr>
+          <w:rFonts w:ascii="Times New Roman" w:hAnsi="Times New Roman" w:cs="Times New Roman"/>
+        </w:rPr>
+        <w:t xml:space="preserve"> </w:t>
+      </w:r>
+      <w:proofErr w:type="spellStart"/>
+      <w:r>
+        <w:rPr>
+          <w:rFonts w:ascii="Times New Roman" w:hAnsi="Times New Roman" w:cs="Times New Roman"/>
+        </w:rPr>
         <w:t>khóa</w:t>
       </w:r>
       <w:proofErr w:type="spellEnd"/>
     </w:p>
     <w:p>
-      <w:r>
+      <w:pPr>
+        <w:rPr>
+          <w:rFonts w:ascii="Times New Roman" w:hAnsi="Times New Roman" w:cs="Times New Roman"/>
+        </w:rPr>
+      </w:pPr>
+      <w:r>
+        <w:rPr>
+          <w:rFonts w:ascii="Times New Roman" w:hAnsi="Times New Roman" w:cs="Times New Roman"/>
+        </w:rPr>
         <w:t>- [</w:t>
       </w:r>
       <w:proofErr w:type="gramStart"/>
       <w:r>
-        <w:t>v</w:t>
-      </w:r>
-      <w:r>
-        <w:t xml:space="preserve"> ]</w:t>
+        <w:rPr>
+          <w:rFonts w:ascii="Times New Roman" w:hAnsi="Times New Roman" w:cs="Times New Roman"/>
+        </w:rPr>
+        <w:t>v ]</w:t>
       </w:r>
       <w:proofErr w:type="gramEnd"/>
       <w:r>
-        <w:t xml:space="preserve"> </w:t>
-      </w:r>
-      <w:r>
-        <w:rPr>
+        <w:rPr>
+          <w:rFonts w:ascii="Times New Roman" w:hAnsi="Times New Roman" w:cs="Times New Roman"/>
+        </w:rPr>
+        <w:t xml:space="preserve"> </w:t>
+      </w:r>
+      <w:r>
+        <w:rPr>
+          <w:rFonts w:ascii="Times New Roman" w:hAnsi="Times New Roman" w:cs="Times New Roman"/>
           <w:b/>
           <w:bCs/>
         </w:rPr>
         <w:t>**B5**</w:t>
       </w:r>
       <w:r>
+        <w:rPr>
+          <w:rFonts w:ascii="Times New Roman" w:hAnsi="Times New Roman" w:cs="Times New Roman"/>
+        </w:rPr>
         <w:t xml:space="preserve"> ≥ 3 test </w:t>
       </w:r>
       <w:proofErr w:type="spellStart"/>
       <w:r>
+        <w:rPr>
+          <w:rFonts w:ascii="Times New Roman" w:hAnsi="Times New Roman" w:cs="Times New Roman"/>
+        </w:rPr>
         <w:t>thứ</w:t>
       </w:r>
       <w:proofErr w:type="spellEnd"/>
       <w:r>
-        <w:t xml:space="preserve"> </w:t>
-      </w:r>
-      <w:proofErr w:type="spellStart"/>
-      <w:r>
+        <w:rPr>
+          <w:rFonts w:ascii="Times New Roman" w:hAnsi="Times New Roman" w:cs="Times New Roman"/>
+        </w:rPr>
+        <w:t xml:space="preserve"> </w:t>
+      </w:r>
+      <w:proofErr w:type="spellStart"/>
+      <w:r>
+        <w:rPr>
+          <w:rFonts w:ascii="Times New Roman" w:hAnsi="Times New Roman" w:cs="Times New Roman"/>
+        </w:rPr>
         <w:t>tự</w:t>
       </w:r>
       <w:proofErr w:type="spellEnd"/>
       <w:r>
-        <w:t xml:space="preserve"> </w:t>
-      </w:r>
-      <w:proofErr w:type="spellStart"/>
-      <w:r>
+        <w:rPr>
+          <w:rFonts w:ascii="Times New Roman" w:hAnsi="Times New Roman" w:cs="Times New Roman"/>
+        </w:rPr>
+        <w:t xml:space="preserve"> </w:t>
+      </w:r>
+      <w:proofErr w:type="spellStart"/>
+      <w:r>
+        <w:rPr>
+          <w:rFonts w:ascii="Times New Roman" w:hAnsi="Times New Roman" w:cs="Times New Roman"/>
+        </w:rPr>
         <w:t>ưu</w:t>
       </w:r>
       <w:proofErr w:type="spellEnd"/>
       <w:r>
-        <w:t xml:space="preserve"> </w:t>
-      </w:r>
-      <w:proofErr w:type="spellStart"/>
-      <w:r>
+        <w:rPr>
+          <w:rFonts w:ascii="Times New Roman" w:hAnsi="Times New Roman" w:cs="Times New Roman"/>
+        </w:rPr>
+        <w:t xml:space="preserve"> </w:t>
+      </w:r>
+      <w:proofErr w:type="spellStart"/>
+      <w:r>
+        <w:rPr>
+          <w:rFonts w:ascii="Times New Roman" w:hAnsi="Times New Roman" w:cs="Times New Roman"/>
+        </w:rPr>
         <w:t>tiên</w:t>
       </w:r>
       <w:proofErr w:type="spellEnd"/>
       <w:r>
-        <w:t xml:space="preserve"> </w:t>
-      </w:r>
-      <w:proofErr w:type="spellStart"/>
-      <w:r>
+        <w:rPr>
+          <w:rFonts w:ascii="Times New Roman" w:hAnsi="Times New Roman" w:cs="Times New Roman"/>
+        </w:rPr>
+        <w:t xml:space="preserve"> </w:t>
+      </w:r>
+      <w:proofErr w:type="spellStart"/>
+      <w:r>
+        <w:rPr>
+          <w:rFonts w:ascii="Times New Roman" w:hAnsi="Times New Roman" w:cs="Times New Roman"/>
+        </w:rPr>
         <w:t>trong</w:t>
       </w:r>
       <w:proofErr w:type="spellEnd"/>
       <w:r>
+        <w:rPr>
+          <w:rFonts w:ascii="Times New Roman" w:hAnsi="Times New Roman" w:cs="Times New Roman"/>
+        </w:rPr>
         <w:t xml:space="preserve"> `</w:t>
       </w:r>
       <w:proofErr w:type="gramStart"/>
       <w:r>
+        <w:rPr>
+          <w:rFonts w:ascii="Times New Roman" w:hAnsi="Times New Roman" w:cs="Times New Roman"/>
+        </w:rPr>
         <w:t>register(</w:t>
       </w:r>
       <w:proofErr w:type="gramEnd"/>
       <w:r>
+        <w:rPr>
+          <w:rFonts w:ascii="Times New Roman" w:hAnsi="Times New Roman" w:cs="Times New Roman"/>
+        </w:rPr>
         <w:t>)`</w:t>
       </w:r>
     </w:p>
     <w:p>
-      <w:r>
+      <w:pPr>
+        <w:rPr>
+          <w:rFonts w:ascii="Times New Roman" w:hAnsi="Times New Roman" w:cs="Times New Roman"/>
+        </w:rPr>
+      </w:pPr>
+      <w:r>
+        <w:rPr>
+          <w:rFonts w:ascii="Times New Roman" w:hAnsi="Times New Roman" w:cs="Times New Roman"/>
+        </w:rPr>
         <w:t>- [</w:t>
       </w:r>
       <w:proofErr w:type="gramStart"/>
       <w:r>
-        <w:t>v</w:t>
-      </w:r>
-      <w:r>
-        <w:t xml:space="preserve"> ]</w:t>
+        <w:rPr>
+          <w:rFonts w:ascii="Times New Roman" w:hAnsi="Times New Roman" w:cs="Times New Roman"/>
+        </w:rPr>
+        <w:t>v ]</w:t>
       </w:r>
       <w:proofErr w:type="gramEnd"/>
       <w:r>
-        <w:t xml:space="preserve"> </w:t>
-      </w:r>
-      <w:r>
-        <w:rPr>
+        <w:rPr>
+          <w:rFonts w:ascii="Times New Roman" w:hAnsi="Times New Roman" w:cs="Times New Roman"/>
+        </w:rPr>
+        <w:t xml:space="preserve"> </w:t>
+      </w:r>
+      <w:r>
+        <w:rPr>
+          <w:rFonts w:ascii="Times New Roman" w:hAnsi="Times New Roman" w:cs="Times New Roman"/>
           <w:b/>
           <w:bCs/>
         </w:rPr>
         <w:t>**B6**</w:t>
       </w:r>
       <w:r>
+        <w:rPr>
+          <w:rFonts w:ascii="Times New Roman" w:hAnsi="Times New Roman" w:cs="Times New Roman"/>
+        </w:rPr>
         <w:t xml:space="preserve"> `@Nested` + `@BeforeEach` </w:t>
       </w:r>
       <w:proofErr w:type="spellStart"/>
       <w:r>
+        <w:rPr>
+          <w:rFonts w:ascii="Times New Roman" w:hAnsi="Times New Roman" w:cs="Times New Roman"/>
+        </w:rPr>
         <w:t>tạo</w:t>
       </w:r>
       <w:proofErr w:type="spellEnd"/>
       <w:r>
+        <w:rPr>
+          <w:rFonts w:ascii="Times New Roman" w:hAnsi="Times New Roman" w:cs="Times New Roman"/>
+        </w:rPr>
         <w:t xml:space="preserve"> service </w:t>
       </w:r>
       <w:proofErr w:type="spellStart"/>
       <w:r>
+        <w:rPr>
+          <w:rFonts w:ascii="Times New Roman" w:hAnsi="Times New Roman" w:cs="Times New Roman"/>
+        </w:rPr>
         <w:t>mới</w:t>
       </w:r>
       <w:proofErr w:type="spellEnd"/>
       <w:r>
-        <w:t xml:space="preserve"> </w:t>
-      </w:r>
-      <w:proofErr w:type="spellStart"/>
-      <w:r>
+        <w:rPr>
+          <w:rFonts w:ascii="Times New Roman" w:hAnsi="Times New Roman" w:cs="Times New Roman"/>
+        </w:rPr>
+        <w:t xml:space="preserve"> </w:t>
+      </w:r>
+      <w:proofErr w:type="spellStart"/>
+      <w:r>
+        <w:rPr>
+          <w:rFonts w:ascii="Times New Roman" w:hAnsi="Times New Roman" w:cs="Times New Roman"/>
+        </w:rPr>
         <w:t>cho</w:t>
       </w:r>
       <w:proofErr w:type="spellEnd"/>
       <w:r>
-        <w:t xml:space="preserve"> </w:t>
-      </w:r>
-      <w:proofErr w:type="spellStart"/>
-      <w:r>
+        <w:rPr>
+          <w:rFonts w:ascii="Times New Roman" w:hAnsi="Times New Roman" w:cs="Times New Roman"/>
+        </w:rPr>
+        <w:t xml:space="preserve"> </w:t>
+      </w:r>
+      <w:proofErr w:type="spellStart"/>
+      <w:r>
+        <w:rPr>
+          <w:rFonts w:ascii="Times New Roman" w:hAnsi="Times New Roman" w:cs="Times New Roman"/>
+        </w:rPr>
         <w:t>mỗi</w:t>
       </w:r>
       <w:proofErr w:type="spellEnd"/>
       <w:r>
+        <w:rPr>
+          <w:rFonts w:ascii="Times New Roman" w:hAnsi="Times New Roman" w:cs="Times New Roman"/>
+        </w:rPr>
         <w:t xml:space="preserve"> test</w:t>
       </w:r>
     </w:p>
     <w:p>
-      <w:r>
+      <w:pPr>
+        <w:rPr>
+          <w:rFonts w:ascii="Times New Roman" w:hAnsi="Times New Roman" w:cs="Times New Roman"/>
+        </w:rPr>
+      </w:pPr>
+      <w:r>
+        <w:rPr>
+          <w:rFonts w:ascii="Times New Roman" w:hAnsi="Times New Roman" w:cs="Times New Roman"/>
+        </w:rPr>
         <w:t>- [</w:t>
       </w:r>
       <w:proofErr w:type="gramStart"/>
       <w:r>
-        <w:t>v</w:t>
-      </w:r>
-      <w:r>
-        <w:t xml:space="preserve"> ]</w:t>
+        <w:rPr>
+          <w:rFonts w:ascii="Times New Roman" w:hAnsi="Times New Roman" w:cs="Times New Roman"/>
+        </w:rPr>
+        <w:t>v ]</w:t>
       </w:r>
       <w:proofErr w:type="gramEnd"/>
       <w:r>
-        <w:t xml:space="preserve"> </w:t>
-      </w:r>
-      <w:r>
-        <w:rPr>
+        <w:rPr>
+          <w:rFonts w:ascii="Times New Roman" w:hAnsi="Times New Roman" w:cs="Times New Roman"/>
+        </w:rPr>
+        <w:t xml:space="preserve"> </w:t>
+      </w:r>
+      <w:r>
+        <w:rPr>
+          <w:rFonts w:ascii="Times New Roman" w:hAnsi="Times New Roman" w:cs="Times New Roman"/>
           <w:b/>
           <w:bCs/>
         </w:rPr>
         <w:t>**B7**</w:t>
       </w:r>
       <w:r>
+        <w:rPr>
+          <w:rFonts w:ascii="Times New Roman" w:hAnsi="Times New Roman" w:cs="Times New Roman"/>
+        </w:rPr>
         <w:t xml:space="preserve"> Assert </w:t>
       </w:r>
       <w:proofErr w:type="spellStart"/>
       <w:r>
+        <w:rPr>
+          <w:rFonts w:ascii="Times New Roman" w:hAnsi="Times New Roman" w:cs="Times New Roman"/>
+        </w:rPr>
         <w:t>cả</w:t>
       </w:r>
       <w:proofErr w:type="spellEnd"/>
       <w:r>
-        <w:t xml:space="preserve"> </w:t>
-      </w:r>
-      <w:proofErr w:type="spellStart"/>
-      <w:r>
+        <w:rPr>
+          <w:rFonts w:ascii="Times New Roman" w:hAnsi="Times New Roman" w:cs="Times New Roman"/>
+        </w:rPr>
+        <w:t xml:space="preserve"> </w:t>
+      </w:r>
+      <w:proofErr w:type="spellStart"/>
+      <w:r>
+        <w:rPr>
+          <w:rFonts w:ascii="Times New Roman" w:hAnsi="Times New Roman" w:cs="Times New Roman"/>
+        </w:rPr>
         <w:t>trạng</w:t>
       </w:r>
       <w:proofErr w:type="spellEnd"/>
       <w:r>
-        <w:t xml:space="preserve"> </w:t>
-      </w:r>
-      <w:proofErr w:type="spellStart"/>
-      <w:r>
+        <w:rPr>
+          <w:rFonts w:ascii="Times New Roman" w:hAnsi="Times New Roman" w:cs="Times New Roman"/>
+        </w:rPr>
+        <w:t xml:space="preserve"> </w:t>
+      </w:r>
+      <w:proofErr w:type="spellStart"/>
+      <w:r>
+        <w:rPr>
+          <w:rFonts w:ascii="Times New Roman" w:hAnsi="Times New Roman" w:cs="Times New Roman"/>
+        </w:rPr>
         <w:t>thái</w:t>
       </w:r>
       <w:proofErr w:type="spellEnd"/>
       <w:r>
+        <w:rPr>
+          <w:rFonts w:ascii="Times New Roman" w:hAnsi="Times New Roman" w:cs="Times New Roman"/>
+        </w:rPr>
         <w:t xml:space="preserve">, </w:t>
       </w:r>
       <w:proofErr w:type="spellStart"/>
       <w:r>
+        <w:rPr>
+          <w:rFonts w:ascii="Times New Roman" w:hAnsi="Times New Roman" w:cs="Times New Roman"/>
+        </w:rPr>
         <w:t>không</w:t>
       </w:r>
       <w:proofErr w:type="spellEnd"/>
       <w:r>
+        <w:rPr>
+          <w:rFonts w:ascii="Times New Roman" w:hAnsi="Times New Roman" w:cs="Times New Roman"/>
+        </w:rPr>
         <w:t xml:space="preserve"> `</w:t>
       </w:r>
       <w:proofErr w:type="spellStart"/>
       <w:r>
+        <w:rPr>
+          <w:rFonts w:ascii="Times New Roman" w:hAnsi="Times New Roman" w:cs="Times New Roman"/>
+        </w:rPr>
         <w:t>assertTrue</w:t>
       </w:r>
       <w:proofErr w:type="spellEnd"/>
       <w:r>
+        <w:rPr>
+          <w:rFonts w:ascii="Times New Roman" w:hAnsi="Times New Roman" w:cs="Times New Roman"/>
+        </w:rPr>
         <w:t xml:space="preserve">(true)`, </w:t>
       </w:r>
       <w:proofErr w:type="spellStart"/>
       <w:r>
+        <w:rPr>
+          <w:rFonts w:ascii="Times New Roman" w:hAnsi="Times New Roman" w:cs="Times New Roman"/>
+        </w:rPr>
         <w:t>không</w:t>
       </w:r>
       <w:proofErr w:type="spellEnd"/>
       <w:r>
+        <w:rPr>
+          <w:rFonts w:ascii="Times New Roman" w:hAnsi="Times New Roman" w:cs="Times New Roman"/>
+        </w:rPr>
         <w:t xml:space="preserve"> `</w:t>
       </w:r>
       <w:proofErr w:type="spellStart"/>
       <w:r>
+        <w:rPr>
+          <w:rFonts w:ascii="Times New Roman" w:hAnsi="Times New Roman" w:cs="Times New Roman"/>
+        </w:rPr>
         <w:t>Thread.sleep</w:t>
       </w:r>
       <w:proofErr w:type="spellEnd"/>
       <w:r>
+        <w:rPr>
+          <w:rFonts w:ascii="Times New Roman" w:hAnsi="Times New Roman" w:cs="Times New Roman"/>
+        </w:rPr>
         <w:t>`</w:t>
       </w:r>
     </w:p>
     <w:p>
-      <w:r>
-        <w:t xml:space="preserve">- [ </w:t>
-      </w:r>
-      <w:r>
-        <w:t>v</w:t>
-      </w:r>
-      <w:r>
-        <w:t xml:space="preserve">] </w:t>
-      </w:r>
-      <w:r>
-        <w:rPr>
+      <w:pPr>
+        <w:rPr>
+          <w:rFonts w:ascii="Times New Roman" w:hAnsi="Times New Roman" w:cs="Times New Roman"/>
+        </w:rPr>
+      </w:pPr>
+      <w:r>
+        <w:rPr>
+          <w:rFonts w:ascii="Times New Roman" w:hAnsi="Times New Roman" w:cs="Times New Roman"/>
+        </w:rPr>
+        <w:t xml:space="preserve">- [ v] </w:t>
+      </w:r>
+      <w:r>
+        <w:rPr>
+          <w:rFonts w:ascii="Times New Roman" w:hAnsi="Times New Roman" w:cs="Times New Roman"/>
           <w:b/>
           <w:bCs/>
         </w:rPr>
         <w:t>**B8**</w:t>
       </w:r>
       <w:r>
-        <w:t xml:space="preserve"> </w:t>
-      </w:r>
-      <w:proofErr w:type="spellStart"/>
-      <w:r>
+        <w:rPr>
+          <w:rFonts w:ascii="Times New Roman" w:hAnsi="Times New Roman" w:cs="Times New Roman"/>
+        </w:rPr>
+        <w:t xml:space="preserve"> </w:t>
+      </w:r>
+      <w:proofErr w:type="spellStart"/>
+      <w:r>
+        <w:rPr>
+          <w:rFonts w:ascii="Times New Roman" w:hAnsi="Times New Roman" w:cs="Times New Roman"/>
+        </w:rPr>
         <w:t>Tên</w:t>
       </w:r>
       <w:proofErr w:type="spellEnd"/>
       <w:r>
+        <w:rPr>
+          <w:rFonts w:ascii="Times New Roman" w:hAnsi="Times New Roman" w:cs="Times New Roman"/>
+        </w:rPr>
         <w:t xml:space="preserve"> test </w:t>
       </w:r>
       <w:proofErr w:type="spellStart"/>
       <w:r>
+        <w:rPr>
+          <w:rFonts w:ascii="Times New Roman" w:hAnsi="Times New Roman" w:cs="Times New Roman"/>
+        </w:rPr>
         <w:t>theo</w:t>
       </w:r>
       <w:proofErr w:type="spellEnd"/>
       <w:r>
-        <w:t xml:space="preserve"> </w:t>
-      </w:r>
-      <w:proofErr w:type="spellStart"/>
-      <w:r>
+        <w:rPr>
+          <w:rFonts w:ascii="Times New Roman" w:hAnsi="Times New Roman" w:cs="Times New Roman"/>
+        </w:rPr>
+        <w:t xml:space="preserve"> </w:t>
+      </w:r>
+      <w:proofErr w:type="spellStart"/>
+      <w:r>
+        <w:rPr>
+          <w:rFonts w:ascii="Times New Roman" w:hAnsi="Times New Roman" w:cs="Times New Roman"/>
+        </w:rPr>
         <w:t>mẫu</w:t>
       </w:r>
       <w:proofErr w:type="spellEnd"/>
       <w:r>
+        <w:rPr>
+          <w:rFonts w:ascii="Times New Roman" w:hAnsi="Times New Roman" w:cs="Times New Roman"/>
+        </w:rPr>
         <w:t xml:space="preserve"> `</w:t>
       </w:r>
       <w:proofErr w:type="spellStart"/>
       <w:r>
+        <w:rPr>
+          <w:rFonts w:ascii="Times New Roman" w:hAnsi="Times New Roman" w:cs="Times New Roman"/>
+        </w:rPr>
         <w:t>method_TinhHuong_KetQua</w:t>
       </w:r>
       <w:proofErr w:type="spellEnd"/>
       <w:r>
+        <w:rPr>
+          <w:rFonts w:ascii="Times New Roman" w:hAnsi="Times New Roman" w:cs="Times New Roman"/>
+        </w:rPr>
         <w:t>`, AAA</w:t>
       </w:r>
     </w:p>
-    <w:p/>
     <w:p>
-      <w:r>
-        <w:rPr>
+      <w:pPr>
+        <w:rPr>
+          <w:rFonts w:ascii="Times New Roman" w:hAnsi="Times New Roman" w:cs="Times New Roman"/>
+        </w:rPr>
+      </w:pPr>
+    </w:p>
+    <w:p>
+      <w:pPr>
+        <w:rPr>
+          <w:rFonts w:ascii="Times New Roman" w:hAnsi="Times New Roman" w:cs="Times New Roman"/>
+        </w:rPr>
+      </w:pPr>
+      <w:r>
+        <w:rPr>
+          <w:rFonts w:ascii="Times New Roman" w:hAnsi="Times New Roman" w:cs="Times New Roman"/>
           <w:b/>
           <w:bCs/>
         </w:rPr>
@@ -1619,6 +2507,7 @@
       <w:proofErr w:type="spellStart"/>
       <w:r>
         <w:rPr>
+          <w:rFonts w:ascii="Times New Roman" w:hAnsi="Times New Roman" w:cs="Times New Roman"/>
           <w:b/>
           <w:bCs/>
         </w:rPr>
@@ -1627,6 +2516,7 @@
       <w:proofErr w:type="spellEnd"/>
       <w:r>
         <w:rPr>
+          <w:rFonts w:ascii="Times New Roman" w:hAnsi="Times New Roman" w:cs="Times New Roman"/>
           <w:b/>
           <w:bCs/>
         </w:rPr>
@@ -1635,6 +2525,7 @@
       <w:proofErr w:type="spellStart"/>
       <w:r>
         <w:rPr>
+          <w:rFonts w:ascii="Times New Roman" w:hAnsi="Times New Roman" w:cs="Times New Roman"/>
           <w:b/>
           <w:bCs/>
         </w:rPr>
@@ -1643,6 +2534,7 @@
       <w:proofErr w:type="spellEnd"/>
       <w:r>
         <w:rPr>
+          <w:rFonts w:ascii="Times New Roman" w:hAnsi="Times New Roman" w:cs="Times New Roman"/>
           <w:b/>
           <w:bCs/>
         </w:rPr>
@@ -1651,6 +2543,7 @@
       <w:proofErr w:type="spellStart"/>
       <w:r>
         <w:rPr>
+          <w:rFonts w:ascii="Times New Roman" w:hAnsi="Times New Roman" w:cs="Times New Roman"/>
           <w:b/>
           <w:bCs/>
         </w:rPr>
@@ -1659,6 +2552,7 @@
       <w:proofErr w:type="spellEnd"/>
       <w:r>
         <w:rPr>
+          <w:rFonts w:ascii="Times New Roman" w:hAnsi="Times New Roman" w:cs="Times New Roman"/>
           <w:b/>
           <w:bCs/>
         </w:rPr>
@@ -1667,6 +2561,7 @@
       <w:proofErr w:type="spellStart"/>
       <w:r>
         <w:rPr>
+          <w:rFonts w:ascii="Times New Roman" w:hAnsi="Times New Roman" w:cs="Times New Roman"/>
           <w:b/>
           <w:bCs/>
         </w:rPr>
@@ -1675,6 +2570,7 @@
       <w:proofErr w:type="spellEnd"/>
       <w:r>
         <w:rPr>
+          <w:rFonts w:ascii="Times New Roman" w:hAnsi="Times New Roman" w:cs="Times New Roman"/>
           <w:b/>
           <w:bCs/>
         </w:rPr>
@@ -1683,6 +2579,7 @@
       <w:proofErr w:type="spellStart"/>
       <w:r>
         <w:rPr>
+          <w:rFonts w:ascii="Times New Roman" w:hAnsi="Times New Roman" w:cs="Times New Roman"/>
           <w:b/>
           <w:bCs/>
         </w:rPr>
@@ -1691,236 +2588,401 @@
       <w:proofErr w:type="spellEnd"/>
     </w:p>
     <w:p>
-      <w:r>
+      <w:pPr>
+        <w:rPr>
+          <w:rFonts w:ascii="Times New Roman" w:hAnsi="Times New Roman" w:cs="Times New Roman"/>
+        </w:rPr>
+      </w:pPr>
+      <w:r>
+        <w:rPr>
+          <w:rFonts w:ascii="Times New Roman" w:hAnsi="Times New Roman" w:cs="Times New Roman"/>
+        </w:rPr>
         <w:t>- [</w:t>
       </w:r>
       <w:proofErr w:type="gramStart"/>
       <w:r>
-        <w:t>v</w:t>
-      </w:r>
-      <w:r>
-        <w:t xml:space="preserve"> ]</w:t>
+        <w:rPr>
+          <w:rFonts w:ascii="Times New Roman" w:hAnsi="Times New Roman" w:cs="Times New Roman"/>
+        </w:rPr>
+        <w:t>v ]</w:t>
       </w:r>
       <w:proofErr w:type="gramEnd"/>
       <w:r>
-        <w:t xml:space="preserve"> </w:t>
-      </w:r>
-      <w:r>
-        <w:rPr>
+        <w:rPr>
+          <w:rFonts w:ascii="Times New Roman" w:hAnsi="Times New Roman" w:cs="Times New Roman"/>
+        </w:rPr>
+        <w:t xml:space="preserve"> </w:t>
+      </w:r>
+      <w:r>
+        <w:rPr>
+          <w:rFonts w:ascii="Times New Roman" w:hAnsi="Times New Roman" w:cs="Times New Roman"/>
           <w:b/>
           <w:bCs/>
         </w:rPr>
         <w:t>**C1**</w:t>
       </w:r>
       <w:r>
+        <w:rPr>
+          <w:rFonts w:ascii="Times New Roman" w:hAnsi="Times New Roman" w:cs="Times New Roman"/>
+        </w:rPr>
         <w:t xml:space="preserve"> `</w:t>
       </w:r>
       <w:proofErr w:type="spellStart"/>
       <w:r>
+        <w:rPr>
+          <w:rFonts w:ascii="Times New Roman" w:hAnsi="Times New Roman" w:cs="Times New Roman"/>
+        </w:rPr>
         <w:t>mvn</w:t>
       </w:r>
       <w:proofErr w:type="spellEnd"/>
       <w:r>
+        <w:rPr>
+          <w:rFonts w:ascii="Times New Roman" w:hAnsi="Times New Roman" w:cs="Times New Roman"/>
+        </w:rPr>
         <w:t xml:space="preserve"> clean test`: 0 failures / errors / skipped</w:t>
       </w:r>
     </w:p>
     <w:p>
-      <w:r>
+      <w:pPr>
+        <w:rPr>
+          <w:rFonts w:ascii="Times New Roman" w:hAnsi="Times New Roman" w:cs="Times New Roman"/>
+        </w:rPr>
+      </w:pPr>
+      <w:r>
+        <w:rPr>
+          <w:rFonts w:ascii="Times New Roman" w:hAnsi="Times New Roman" w:cs="Times New Roman"/>
+        </w:rPr>
         <w:t>- [</w:t>
       </w:r>
       <w:proofErr w:type="gramStart"/>
       <w:r>
-        <w:t>v</w:t>
-      </w:r>
-      <w:r>
-        <w:t xml:space="preserve"> ]</w:t>
+        <w:rPr>
+          <w:rFonts w:ascii="Times New Roman" w:hAnsi="Times New Roman" w:cs="Times New Roman"/>
+        </w:rPr>
+        <w:t>v ]</w:t>
       </w:r>
       <w:proofErr w:type="gramEnd"/>
       <w:r>
-        <w:t xml:space="preserve"> </w:t>
-      </w:r>
-      <w:r>
-        <w:rPr>
+        <w:rPr>
+          <w:rFonts w:ascii="Times New Roman" w:hAnsi="Times New Roman" w:cs="Times New Roman"/>
+        </w:rPr>
+        <w:t xml:space="preserve"> </w:t>
+      </w:r>
+      <w:r>
+        <w:rPr>
+          <w:rFonts w:ascii="Times New Roman" w:hAnsi="Times New Roman" w:cs="Times New Roman"/>
           <w:b/>
           <w:bCs/>
         </w:rPr>
         <w:t>**C2**</w:t>
       </w:r>
       <w:r>
-        <w:t xml:space="preserve"> </w:t>
-      </w:r>
-      <w:proofErr w:type="spellStart"/>
-      <w:r>
+        <w:rPr>
+          <w:rFonts w:ascii="Times New Roman" w:hAnsi="Times New Roman" w:cs="Times New Roman"/>
+        </w:rPr>
+        <w:t xml:space="preserve"> </w:t>
+      </w:r>
+      <w:proofErr w:type="spellStart"/>
+      <w:r>
+        <w:rPr>
+          <w:rFonts w:ascii="Times New Roman" w:hAnsi="Times New Roman" w:cs="Times New Roman"/>
+        </w:rPr>
         <w:t>JaCoCo</w:t>
       </w:r>
       <w:proofErr w:type="spellEnd"/>
       <w:r>
+        <w:rPr>
+          <w:rFonts w:ascii="Times New Roman" w:hAnsi="Times New Roman" w:cs="Times New Roman"/>
+        </w:rPr>
         <w:t xml:space="preserve"> Line ≥ 80%, Branch ≥ 70% (</w:t>
       </w:r>
       <w:proofErr w:type="spellStart"/>
       <w:r>
+        <w:rPr>
+          <w:rFonts w:ascii="Times New Roman" w:hAnsi="Times New Roman" w:cs="Times New Roman"/>
+        </w:rPr>
         <w:t>có</w:t>
       </w:r>
       <w:proofErr w:type="spellEnd"/>
       <w:r>
-        <w:t xml:space="preserve"> </w:t>
-      </w:r>
-      <w:proofErr w:type="spellStart"/>
-      <w:r>
+        <w:rPr>
+          <w:rFonts w:ascii="Times New Roman" w:hAnsi="Times New Roman" w:cs="Times New Roman"/>
+        </w:rPr>
+        <w:t xml:space="preserve"> </w:t>
+      </w:r>
+      <w:proofErr w:type="spellStart"/>
+      <w:r>
+        <w:rPr>
+          <w:rFonts w:ascii="Times New Roman" w:hAnsi="Times New Roman" w:cs="Times New Roman"/>
+        </w:rPr>
         <w:t>ảnh</w:t>
       </w:r>
       <w:proofErr w:type="spellEnd"/>
       <w:r>
-        <w:t xml:space="preserve"> </w:t>
-      </w:r>
-      <w:proofErr w:type="spellStart"/>
-      <w:r>
+        <w:rPr>
+          <w:rFonts w:ascii="Times New Roman" w:hAnsi="Times New Roman" w:cs="Times New Roman"/>
+        </w:rPr>
+        <w:t xml:space="preserve"> </w:t>
+      </w:r>
+      <w:proofErr w:type="spellStart"/>
+      <w:r>
+        <w:rPr>
+          <w:rFonts w:ascii="Times New Roman" w:hAnsi="Times New Roman" w:cs="Times New Roman"/>
+        </w:rPr>
         <w:t>chụp</w:t>
       </w:r>
       <w:proofErr w:type="spellEnd"/>
       <w:r>
+        <w:rPr>
+          <w:rFonts w:ascii="Times New Roman" w:hAnsi="Times New Roman" w:cs="Times New Roman"/>
+        </w:rPr>
         <w:t>)</w:t>
       </w:r>
     </w:p>
     <w:p>
-      <w:r>
+      <w:pPr>
+        <w:rPr>
+          <w:rFonts w:ascii="Times New Roman" w:hAnsi="Times New Roman" w:cs="Times New Roman"/>
+        </w:rPr>
+      </w:pPr>
+      <w:r>
+        <w:rPr>
+          <w:rFonts w:ascii="Times New Roman" w:hAnsi="Times New Roman" w:cs="Times New Roman"/>
+        </w:rPr>
         <w:t>- [</w:t>
       </w:r>
       <w:proofErr w:type="gramStart"/>
       <w:r>
-        <w:t>v</w:t>
-      </w:r>
-      <w:r>
-        <w:t xml:space="preserve"> ]</w:t>
+        <w:rPr>
+          <w:rFonts w:ascii="Times New Roman" w:hAnsi="Times New Roman" w:cs="Times New Roman"/>
+        </w:rPr>
+        <w:t>v ]</w:t>
       </w:r>
       <w:proofErr w:type="gramEnd"/>
       <w:r>
-        <w:t xml:space="preserve"> </w:t>
-      </w:r>
-      <w:r>
-        <w:rPr>
+        <w:rPr>
+          <w:rFonts w:ascii="Times New Roman" w:hAnsi="Times New Roman" w:cs="Times New Roman"/>
+        </w:rPr>
+        <w:t xml:space="preserve"> </w:t>
+      </w:r>
+      <w:r>
+        <w:rPr>
+          <w:rFonts w:ascii="Times New Roman" w:hAnsi="Times New Roman" w:cs="Times New Roman"/>
           <w:b/>
           <w:bCs/>
         </w:rPr>
         <w:t>**C3**</w:t>
       </w:r>
       <w:r>
+        <w:rPr>
+          <w:rFonts w:ascii="Times New Roman" w:hAnsi="Times New Roman" w:cs="Times New Roman"/>
+        </w:rPr>
         <w:t xml:space="preserve"> ≥ 3 </w:t>
       </w:r>
       <w:proofErr w:type="spellStart"/>
       <w:r>
+        <w:rPr>
+          <w:rFonts w:ascii="Times New Roman" w:hAnsi="Times New Roman" w:cs="Times New Roman"/>
+        </w:rPr>
         <w:t>lỗi</w:t>
       </w:r>
       <w:proofErr w:type="spellEnd"/>
       <w:r>
-        <w:t xml:space="preserve"> </w:t>
-      </w:r>
-      <w:proofErr w:type="spellStart"/>
-      <w:r>
+        <w:rPr>
+          <w:rFonts w:ascii="Times New Roman" w:hAnsi="Times New Roman" w:cs="Times New Roman"/>
+        </w:rPr>
+        <w:t xml:space="preserve"> </w:t>
+      </w:r>
+      <w:proofErr w:type="spellStart"/>
+      <w:r>
+        <w:rPr>
+          <w:rFonts w:ascii="Times New Roman" w:hAnsi="Times New Roman" w:cs="Times New Roman"/>
+        </w:rPr>
         <w:t>giả</w:t>
       </w:r>
       <w:proofErr w:type="spellEnd"/>
       <w:r>
-        <w:t xml:space="preserve"> </w:t>
-      </w:r>
-      <w:proofErr w:type="spellStart"/>
-      <w:r>
+        <w:rPr>
+          <w:rFonts w:ascii="Times New Roman" w:hAnsi="Times New Roman" w:cs="Times New Roman"/>
+        </w:rPr>
+        <w:t xml:space="preserve"> </w:t>
+      </w:r>
+      <w:proofErr w:type="spellStart"/>
+      <w:r>
+        <w:rPr>
+          <w:rFonts w:ascii="Times New Roman" w:hAnsi="Times New Roman" w:cs="Times New Roman"/>
+        </w:rPr>
         <w:t>lập</w:t>
       </w:r>
       <w:proofErr w:type="spellEnd"/>
       <w:r>
-        <w:t xml:space="preserve"> </w:t>
-      </w:r>
-      <w:proofErr w:type="spellStart"/>
-      <w:r>
+        <w:rPr>
+          <w:rFonts w:ascii="Times New Roman" w:hAnsi="Times New Roman" w:cs="Times New Roman"/>
+        </w:rPr>
+        <w:t xml:space="preserve"> </w:t>
+      </w:r>
+      <w:proofErr w:type="spellStart"/>
+      <w:r>
+        <w:rPr>
+          <w:rFonts w:ascii="Times New Roman" w:hAnsi="Times New Roman" w:cs="Times New Roman"/>
+        </w:rPr>
         <w:t>có</w:t>
       </w:r>
       <w:proofErr w:type="spellEnd"/>
       <w:r>
-        <w:t xml:space="preserve"> </w:t>
-      </w:r>
-      <w:proofErr w:type="spellStart"/>
-      <w:r>
+        <w:rPr>
+          <w:rFonts w:ascii="Times New Roman" w:hAnsi="Times New Roman" w:cs="Times New Roman"/>
+        </w:rPr>
+        <w:t xml:space="preserve"> </w:t>
+      </w:r>
+      <w:proofErr w:type="spellStart"/>
+      <w:r>
+        <w:rPr>
+          <w:rFonts w:ascii="Times New Roman" w:hAnsi="Times New Roman" w:cs="Times New Roman"/>
+        </w:rPr>
         <w:t>ghi</w:t>
       </w:r>
       <w:proofErr w:type="spellEnd"/>
       <w:r>
-        <w:t xml:space="preserve"> </w:t>
-      </w:r>
-      <w:proofErr w:type="spellStart"/>
-      <w:r>
+        <w:rPr>
+          <w:rFonts w:ascii="Times New Roman" w:hAnsi="Times New Roman" w:cs="Times New Roman"/>
+        </w:rPr>
+        <w:t xml:space="preserve"> </w:t>
+      </w:r>
+      <w:proofErr w:type="spellStart"/>
+      <w:r>
+        <w:rPr>
+          <w:rFonts w:ascii="Times New Roman" w:hAnsi="Times New Roman" w:cs="Times New Roman"/>
+        </w:rPr>
         <w:t>lại</w:t>
       </w:r>
       <w:proofErr w:type="spellEnd"/>
     </w:p>
     <w:p>
-      <w:r>
+      <w:pPr>
+        <w:rPr>
+          <w:rFonts w:ascii="Times New Roman" w:hAnsi="Times New Roman" w:cs="Times New Roman"/>
+        </w:rPr>
+      </w:pPr>
+      <w:r>
+        <w:rPr>
+          <w:rFonts w:ascii="Times New Roman" w:hAnsi="Times New Roman" w:cs="Times New Roman"/>
+        </w:rPr>
         <w:t>- [</w:t>
       </w:r>
       <w:proofErr w:type="gramStart"/>
       <w:r>
-        <w:t>v</w:t>
-      </w:r>
-      <w:r>
-        <w:t xml:space="preserve"> ]</w:t>
+        <w:rPr>
+          <w:rFonts w:ascii="Times New Roman" w:hAnsi="Times New Roman" w:cs="Times New Roman"/>
+        </w:rPr>
+        <w:t>v ]</w:t>
       </w:r>
       <w:proofErr w:type="gramEnd"/>
       <w:r>
-        <w:t xml:space="preserve"> </w:t>
-      </w:r>
-      <w:r>
-        <w:rPr>
+        <w:rPr>
+          <w:rFonts w:ascii="Times New Roman" w:hAnsi="Times New Roman" w:cs="Times New Roman"/>
+        </w:rPr>
+        <w:t xml:space="preserve"> </w:t>
+      </w:r>
+      <w:r>
+        <w:rPr>
+          <w:rFonts w:ascii="Times New Roman" w:hAnsi="Times New Roman" w:cs="Times New Roman"/>
           <w:b/>
           <w:bCs/>
         </w:rPr>
         <w:t>**C4**</w:t>
       </w:r>
       <w:r>
-        <w:t xml:space="preserve"> </w:t>
-      </w:r>
-      <w:proofErr w:type="spellStart"/>
-      <w:r>
+        <w:rPr>
+          <w:rFonts w:ascii="Times New Roman" w:hAnsi="Times New Roman" w:cs="Times New Roman"/>
+        </w:rPr>
+        <w:t xml:space="preserve"> </w:t>
+      </w:r>
+      <w:proofErr w:type="spellStart"/>
+      <w:r>
+        <w:rPr>
+          <w:rFonts w:ascii="Times New Roman" w:hAnsi="Times New Roman" w:cs="Times New Roman"/>
+        </w:rPr>
         <w:t>Lịch</w:t>
       </w:r>
       <w:proofErr w:type="spellEnd"/>
       <w:r>
-        <w:t xml:space="preserve"> </w:t>
-      </w:r>
-      <w:proofErr w:type="spellStart"/>
-      <w:r>
+        <w:rPr>
+          <w:rFonts w:ascii="Times New Roman" w:hAnsi="Times New Roman" w:cs="Times New Roman"/>
+        </w:rPr>
+        <w:t xml:space="preserve"> </w:t>
+      </w:r>
+      <w:proofErr w:type="spellStart"/>
+      <w:r>
+        <w:rPr>
+          <w:rFonts w:ascii="Times New Roman" w:hAnsi="Times New Roman" w:cs="Times New Roman"/>
+        </w:rPr>
         <w:t>sử</w:t>
       </w:r>
       <w:proofErr w:type="spellEnd"/>
       <w:r>
+        <w:rPr>
+          <w:rFonts w:ascii="Times New Roman" w:hAnsi="Times New Roman" w:cs="Times New Roman"/>
+        </w:rPr>
         <w:t xml:space="preserve"> git ≥ 6 commit </w:t>
       </w:r>
       <w:proofErr w:type="spellStart"/>
       <w:r>
+        <w:rPr>
+          <w:rFonts w:ascii="Times New Roman" w:hAnsi="Times New Roman" w:cs="Times New Roman"/>
+        </w:rPr>
         <w:t>đúng</w:t>
       </w:r>
       <w:proofErr w:type="spellEnd"/>
       <w:r>
+        <w:rPr>
+          <w:rFonts w:ascii="Times New Roman" w:hAnsi="Times New Roman" w:cs="Times New Roman"/>
+        </w:rPr>
         <w:t xml:space="preserve"> Conventional Commits</w:t>
       </w:r>
     </w:p>
-    <w:p/>
     <w:p>
       <w:pPr>
         <w:pStyle w:val="Heading1"/>
+        <w:rPr>
+          <w:rFonts w:ascii="Times New Roman" w:hAnsi="Times New Roman" w:cs="Times New Roman"/>
+        </w:rPr>
       </w:pPr>
-      <w:bookmarkStart w:id="1" w:name="_Toc241613027"/>
-      <w:r>
-        <w:t xml:space="preserve">II. </w:t>
-      </w:r>
-      <w:proofErr w:type="spellStart"/>
-      <w:r>
+      <w:bookmarkStart w:id="3" w:name="_Toc241613418"/>
+      <w:r>
+        <w:rPr>
+          <w:rFonts w:ascii="Times New Roman" w:hAnsi="Times New Roman" w:cs="Times New Roman"/>
+        </w:rPr>
+        <w:t>I</w:t>
+      </w:r>
+      <w:r>
+        <w:rPr>
+          <w:rFonts w:ascii="Times New Roman" w:hAnsi="Times New Roman" w:cs="Times New Roman"/>
+        </w:rPr>
+        <w:t>I</w:t>
+      </w:r>
+      <w:r>
+        <w:rPr>
+          <w:rFonts w:ascii="Times New Roman" w:hAnsi="Times New Roman" w:cs="Times New Roman"/>
+        </w:rPr>
+        <w:t xml:space="preserve">. </w:t>
+      </w:r>
+      <w:proofErr w:type="spellStart"/>
+      <w:r>
+        <w:rPr>
+          <w:rFonts w:ascii="Times New Roman" w:hAnsi="Times New Roman" w:cs="Times New Roman"/>
+        </w:rPr>
         <w:t>jacoco</w:t>
       </w:r>
       <w:proofErr w:type="spellEnd"/>
       <w:r>
+        <w:rPr>
+          <w:rFonts w:ascii="Times New Roman" w:hAnsi="Times New Roman" w:cs="Times New Roman"/>
+        </w:rPr>
         <w:t xml:space="preserve"> coverage screenshot and mutation table</w:t>
       </w:r>
-      <w:bookmarkEnd w:id="1"/>
+      <w:bookmarkEnd w:id="0"/>
+      <w:bookmarkEnd w:id="3"/>
     </w:p>
     <w:p>
       <w:pPr>
@@ -1932,6 +2994,7 @@
       </w:pPr>
       <w:r>
         <w:rPr>
+          <w:rFonts w:ascii="Times New Roman" w:hAnsi="Times New Roman" w:cs="Times New Roman"/>
           <w:noProof/>
         </w:rPr>
         <w:drawing>
@@ -2622,7 +3685,13 @@
         <w:br/>
       </w:r>
     </w:p>
-    <w:p/>
+    <w:p>
+      <w:pPr>
+        <w:rPr>
+          <w:rFonts w:ascii="Times New Roman" w:hAnsi="Times New Roman" w:cs="Times New Roman"/>
+        </w:rPr>
+      </w:pPr>
+    </w:p>
     <w:sectPr>
       <w:pgSz w:w="12240" w:h="15840"/>
       <w:pgMar w:top="1440" w:right="1440" w:bottom="1440" w:left="1440" w:header="720" w:footer="720" w:gutter="0"/>
@@ -3611,6 +4680,18 @@
       <w:u w:val="single"/>
     </w:rPr>
   </w:style>
+  <w:style w:type="character" w:styleId="FollowedHyperlink">
+    <w:name w:val="FollowedHyperlink"/>
+    <w:basedOn w:val="DefaultParagraphFont"/>
+    <w:uiPriority w:val="99"/>
+    <w:semiHidden/>
+    <w:unhideWhenUsed/>
+    <w:rsid w:val="00D14856"/>
+    <w:rPr>
+      <w:color w:val="96607D" w:themeColor="followedHyperlink"/>
+      <w:u w:val="single"/>
+    </w:rPr>
+  </w:style>
 </w:styles>
 </file>
 

</xml_diff>